<commit_message>
Updated to latest version
</commit_message>
<xml_diff>
--- a/docs/Setting up an SMP for Peppol.docx
+++ b/docs/Setting up an SMP for Peppol.docx
@@ -1,6 +1,6 @@
 
 <file path=word/document.xml><?xml version="1.0" encoding="utf-8"?>
-<w:document xmlns:wpc="http://schemas.microsoft.com/office/word/2010/wordprocessingCanvas" xmlns:cx="http://schemas.microsoft.com/office/drawing/2014/chartex" xmlns:cx1="http://schemas.microsoft.com/office/drawing/2015/9/8/chartex" xmlns:cx2="http://schemas.microsoft.com/office/drawing/2015/10/21/chartex" xmlns:cx3="http://schemas.microsoft.com/office/drawing/2016/5/9/chartex" xmlns:cx4="http://schemas.microsoft.com/office/drawing/2016/5/10/chartex" xmlns:cx5="http://schemas.microsoft.com/office/drawing/2016/5/11/chartex" xmlns:cx6="http://schemas.microsoft.com/office/drawing/2016/5/12/chartex" xmlns:cx7="http://schemas.microsoft.com/office/drawing/2016/5/13/chartex" xmlns:cx8="http://schemas.microsoft.com/office/drawing/2016/5/14/chartex" xmlns:mc="http://schemas.openxmlformats.org/markup-compatibility/2006" xmlns:aink="http://schemas.microsoft.com/office/drawing/2016/ink" xmlns:am3d="http://schemas.microsoft.com/office/drawing/2017/model3d" xmlns:o="urn:schemas-microsoft-com:office:office" xmlns:oel="http://schemas.microsoft.com/office/2019/extlst" xmlns:r="http://schemas.openxmlformats.org/officeDocument/2006/relationships" xmlns:m="http://schemas.openxmlformats.org/officeDocument/2006/math" xmlns:v="urn:schemas-microsoft-com:vml" xmlns:wp14="http://schemas.microsoft.com/office/word/2010/wordprocessingDrawing" xmlns:wp="http://schemas.openxmlformats.org/drawingml/2006/wordprocessingDrawing" xmlns:w10="urn:schemas-microsoft-com:office:word" xmlns:w="http://schemas.openxmlformats.org/wordprocessingml/2006/main" xmlns:w14="http://schemas.microsoft.com/office/word/2010/wordml" xmlns:w15="http://schemas.microsoft.com/office/word/2012/wordml" xmlns:w16cex="http://schemas.microsoft.com/office/word/2018/wordml/cex" xmlns:w16cid="http://schemas.microsoft.com/office/word/2016/wordml/cid" xmlns:w16="http://schemas.microsoft.com/office/word/2018/wordml" xmlns:w16sdtdh="http://schemas.microsoft.com/office/word/2020/wordml/sdtdatahash" xmlns:w16se="http://schemas.microsoft.com/office/word/2015/wordml/symex" xmlns:wpg="http://schemas.microsoft.com/office/word/2010/wordprocessingGroup" xmlns:wpi="http://schemas.microsoft.com/office/word/2010/wordprocessingInk" xmlns:wne="http://schemas.microsoft.com/office/word/2006/wordml" xmlns:wps="http://schemas.microsoft.com/office/word/2010/wordprocessingShape" mc:Ignorable="w14 w15 w16se w16cid w16 w16cex w16sdtdh wp14">
+<w:document xmlns:wpc="http://schemas.microsoft.com/office/word/2010/wordprocessingCanvas" xmlns:cx="http://schemas.microsoft.com/office/drawing/2014/chartex" xmlns:cx1="http://schemas.microsoft.com/office/drawing/2015/9/8/chartex" xmlns:cx2="http://schemas.microsoft.com/office/drawing/2015/10/21/chartex" xmlns:cx3="http://schemas.microsoft.com/office/drawing/2016/5/9/chartex" xmlns:cx4="http://schemas.microsoft.com/office/drawing/2016/5/10/chartex" xmlns:cx5="http://schemas.microsoft.com/office/drawing/2016/5/11/chartex" xmlns:cx6="http://schemas.microsoft.com/office/drawing/2016/5/12/chartex" xmlns:cx7="http://schemas.microsoft.com/office/drawing/2016/5/13/chartex" xmlns:cx8="http://schemas.microsoft.com/office/drawing/2016/5/14/chartex" xmlns:mc="http://schemas.openxmlformats.org/markup-compatibility/2006" xmlns:aink="http://schemas.microsoft.com/office/drawing/2016/ink" xmlns:am3d="http://schemas.microsoft.com/office/drawing/2017/model3d" xmlns:o="urn:schemas-microsoft-com:office:office" xmlns:oel="http://schemas.microsoft.com/office/2019/extlst" xmlns:r="http://schemas.openxmlformats.org/officeDocument/2006/relationships" xmlns:m="http://schemas.openxmlformats.org/officeDocument/2006/math" xmlns:v="urn:schemas-microsoft-com:vml" xmlns:wp14="http://schemas.microsoft.com/office/word/2010/wordprocessingDrawing" xmlns:wp="http://schemas.openxmlformats.org/drawingml/2006/wordprocessingDrawing" xmlns:w10="urn:schemas-microsoft-com:office:word" xmlns:w="http://schemas.openxmlformats.org/wordprocessingml/2006/main" xmlns:w14="http://schemas.microsoft.com/office/word/2010/wordml" xmlns:w15="http://schemas.microsoft.com/office/word/2012/wordml" xmlns:w16cex="http://schemas.microsoft.com/office/word/2018/wordml/cex" xmlns:w16cid="http://schemas.microsoft.com/office/word/2016/wordml/cid" xmlns:w16="http://schemas.microsoft.com/office/word/2018/wordml" xmlns:w16du="http://schemas.microsoft.com/office/word/2023/wordml/word16du" xmlns:w16sdtdh="http://schemas.microsoft.com/office/word/2020/wordml/sdtdatahash" xmlns:w16sdtfl="http://schemas.microsoft.com/office/word/2024/wordml/sdtformatlock" xmlns:w16se="http://schemas.microsoft.com/office/word/2015/wordml/symex" xmlns:wpg="http://schemas.microsoft.com/office/word/2010/wordprocessingGroup" xmlns:wpi="http://schemas.microsoft.com/office/word/2010/wordprocessingInk" xmlns:wne="http://schemas.microsoft.com/office/word/2006/wordml" xmlns:wps="http://schemas.microsoft.com/office/word/2010/wordprocessingShape" mc:Ignorable="w14 w15 w16se w16cid w16 w16cex w16sdtdh w16sdtfl w16du wp14">
   <w:body>
     <w:p>
       <w:pPr>
@@ -57,7 +57,7 @@
         <w:rPr>
           <w:lang w:val="sv-SE"/>
         </w:rPr>
-        <w:t>3</w:t>
+        <w:t>6</w:t>
       </w:r>
       <w:r>
         <w:rPr>
@@ -69,7 +69,7 @@
         <w:rPr>
           <w:lang w:val="sv-SE"/>
         </w:rPr>
-        <w:t>9</w:t>
+        <w:t>4</w:t>
       </w:r>
       <w:r>
         <w:rPr>
@@ -87,7 +87,7 @@
         <w:rPr>
           <w:lang w:val="sv-SE"/>
         </w:rPr>
-        <w:t>7</w:t>
+        <w:t>6</w:t>
       </w:r>
     </w:p>
     <w:p>
@@ -207,7 +207,9 @@
               <w:rFonts w:eastAsiaTheme="minorEastAsia"/>
               <w:noProof/>
               <w:kern w:val="2"/>
-              <w:lang w:eastAsia="en-GB"/>
+              <w:sz w:val="24"/>
+              <w:szCs w:val="24"/>
+              <w:lang w:val="de-AT" w:eastAsia="de-DE"/>
               <w14:ligatures w14:val="standardContextual"/>
             </w:rPr>
           </w:pPr>
@@ -220,7 +222,7 @@
           <w:r>
             <w:fldChar w:fldCharType="separate"/>
           </w:r>
-          <w:hyperlink w:anchor="_Toc146719130" w:history="1">
+          <w:hyperlink w:anchor="_Toc228104595" w:history="1">
             <w:r>
               <w:rPr>
                 <w:rStyle w:val="Hyperlink"/>
@@ -233,7 +235,9 @@
                 <w:rFonts w:eastAsiaTheme="minorEastAsia"/>
                 <w:noProof/>
                 <w:kern w:val="2"/>
-                <w:lang w:eastAsia="en-GB"/>
+                <w:sz w:val="24"/>
+                <w:szCs w:val="24"/>
+                <w:lang w:val="de-AT" w:eastAsia="de-DE"/>
                 <w14:ligatures w14:val="standardContextual"/>
               </w:rPr>
               <w:tab/>
@@ -264,7 +268,7 @@
                 <w:noProof/>
                 <w:webHidden/>
               </w:rPr>
-              <w:instrText xml:space="preserve"> PAGEREF _Toc146719130 \h </w:instrText>
+              <w:instrText xml:space="preserve"> PAGEREF _Toc228104595 \h </w:instrText>
             </w:r>
             <w:r>
               <w:rPr>
@@ -299,18 +303,20 @@
           <w:pPr>
             <w:pStyle w:val="Verzeichnis2"/>
             <w:tabs>
-              <w:tab w:val="left" w:pos="880"/>
+              <w:tab w:val="left" w:pos="960"/>
               <w:tab w:val="right" w:leader="dot" w:pos="9062"/>
             </w:tabs>
             <w:rPr>
               <w:rFonts w:eastAsiaTheme="minorEastAsia"/>
               <w:noProof/>
               <w:kern w:val="2"/>
-              <w:lang w:eastAsia="en-GB"/>
+              <w:sz w:val="24"/>
+              <w:szCs w:val="24"/>
+              <w:lang w:val="de-AT" w:eastAsia="de-DE"/>
               <w14:ligatures w14:val="standardContextual"/>
             </w:rPr>
           </w:pPr>
-          <w:hyperlink w:anchor="_Toc146719131" w:history="1">
+          <w:hyperlink w:anchor="_Toc228104596" w:history="1">
             <w:r>
               <w:rPr>
                 <w:rStyle w:val="Hyperlink"/>
@@ -323,7 +329,9 @@
                 <w:rFonts w:eastAsiaTheme="minorEastAsia"/>
                 <w:noProof/>
                 <w:kern w:val="2"/>
-                <w:lang w:eastAsia="en-GB"/>
+                <w:sz w:val="24"/>
+                <w:szCs w:val="24"/>
+                <w:lang w:val="de-AT" w:eastAsia="de-DE"/>
                 <w14:ligatures w14:val="standardContextual"/>
               </w:rPr>
               <w:tab/>
@@ -354,7 +362,7 @@
                 <w:noProof/>
                 <w:webHidden/>
               </w:rPr>
-              <w:instrText xml:space="preserve"> PAGEREF _Toc146719131 \h </w:instrText>
+              <w:instrText xml:space="preserve"> PAGEREF _Toc228104596 \h </w:instrText>
             </w:r>
             <w:r>
               <w:rPr>
@@ -389,18 +397,20 @@
           <w:pPr>
             <w:pStyle w:val="Verzeichnis2"/>
             <w:tabs>
-              <w:tab w:val="left" w:pos="880"/>
+              <w:tab w:val="left" w:pos="960"/>
               <w:tab w:val="right" w:leader="dot" w:pos="9062"/>
             </w:tabs>
             <w:rPr>
               <w:rFonts w:eastAsiaTheme="minorEastAsia"/>
               <w:noProof/>
               <w:kern w:val="2"/>
-              <w:lang w:eastAsia="en-GB"/>
+              <w:sz w:val="24"/>
+              <w:szCs w:val="24"/>
+              <w:lang w:val="de-AT" w:eastAsia="de-DE"/>
               <w14:ligatures w14:val="standardContextual"/>
             </w:rPr>
           </w:pPr>
-          <w:hyperlink w:anchor="_Toc146719132" w:history="1">
+          <w:hyperlink w:anchor="_Toc228104597" w:history="1">
             <w:r>
               <w:rPr>
                 <w:rStyle w:val="Hyperlink"/>
@@ -413,7 +423,9 @@
                 <w:rFonts w:eastAsiaTheme="minorEastAsia"/>
                 <w:noProof/>
                 <w:kern w:val="2"/>
-                <w:lang w:eastAsia="en-GB"/>
+                <w:sz w:val="24"/>
+                <w:szCs w:val="24"/>
+                <w:lang w:val="de-AT" w:eastAsia="de-DE"/>
                 <w14:ligatures w14:val="standardContextual"/>
               </w:rPr>
               <w:tab/>
@@ -444,7 +456,7 @@
                 <w:noProof/>
                 <w:webHidden/>
               </w:rPr>
-              <w:instrText xml:space="preserve"> PAGEREF _Toc146719132 \h </w:instrText>
+              <w:instrText xml:space="preserve"> PAGEREF _Toc228104597 \h </w:instrText>
             </w:r>
             <w:r>
               <w:rPr>
@@ -486,11 +498,13 @@
               <w:rFonts w:eastAsiaTheme="minorEastAsia"/>
               <w:noProof/>
               <w:kern w:val="2"/>
-              <w:lang w:eastAsia="en-GB"/>
+              <w:sz w:val="24"/>
+              <w:szCs w:val="24"/>
+              <w:lang w:val="de-AT" w:eastAsia="de-DE"/>
               <w14:ligatures w14:val="standardContextual"/>
             </w:rPr>
           </w:pPr>
-          <w:hyperlink w:anchor="_Toc146719133" w:history="1">
+          <w:hyperlink w:anchor="_Toc228104598" w:history="1">
             <w:r>
               <w:rPr>
                 <w:rStyle w:val="Hyperlink"/>
@@ -503,7 +517,9 @@
                 <w:rFonts w:eastAsiaTheme="minorEastAsia"/>
                 <w:noProof/>
                 <w:kern w:val="2"/>
-                <w:lang w:eastAsia="en-GB"/>
+                <w:sz w:val="24"/>
+                <w:szCs w:val="24"/>
+                <w:lang w:val="de-AT" w:eastAsia="de-DE"/>
                 <w14:ligatures w14:val="standardContextual"/>
               </w:rPr>
               <w:tab/>
@@ -534,7 +550,7 @@
                 <w:noProof/>
                 <w:webHidden/>
               </w:rPr>
-              <w:instrText xml:space="preserve"> PAGEREF _Toc146719133 \h </w:instrText>
+              <w:instrText xml:space="preserve"> PAGEREF _Toc228104598 \h </w:instrText>
             </w:r>
             <w:r>
               <w:rPr>
@@ -569,18 +585,20 @@
           <w:pPr>
             <w:pStyle w:val="Verzeichnis2"/>
             <w:tabs>
-              <w:tab w:val="left" w:pos="880"/>
+              <w:tab w:val="left" w:pos="960"/>
               <w:tab w:val="right" w:leader="dot" w:pos="9062"/>
             </w:tabs>
             <w:rPr>
               <w:rFonts w:eastAsiaTheme="minorEastAsia"/>
               <w:noProof/>
               <w:kern w:val="2"/>
-              <w:lang w:eastAsia="en-GB"/>
+              <w:sz w:val="24"/>
+              <w:szCs w:val="24"/>
+              <w:lang w:val="de-AT" w:eastAsia="de-DE"/>
               <w14:ligatures w14:val="standardContextual"/>
             </w:rPr>
           </w:pPr>
-          <w:hyperlink w:anchor="_Toc146719134" w:history="1">
+          <w:hyperlink w:anchor="_Toc228104599" w:history="1">
             <w:r>
               <w:rPr>
                 <w:rStyle w:val="Hyperlink"/>
@@ -593,7 +611,9 @@
                 <w:rFonts w:eastAsiaTheme="minorEastAsia"/>
                 <w:noProof/>
                 <w:kern w:val="2"/>
-                <w:lang w:eastAsia="en-GB"/>
+                <w:sz w:val="24"/>
+                <w:szCs w:val="24"/>
+                <w:lang w:val="de-AT" w:eastAsia="de-DE"/>
                 <w14:ligatures w14:val="standardContextual"/>
               </w:rPr>
               <w:tab/>
@@ -624,7 +644,7 @@
                 <w:noProof/>
                 <w:webHidden/>
               </w:rPr>
-              <w:instrText xml:space="preserve"> PAGEREF _Toc146719134 \h </w:instrText>
+              <w:instrText xml:space="preserve"> PAGEREF _Toc228104599 \h </w:instrText>
             </w:r>
             <w:r>
               <w:rPr>
@@ -659,18 +679,20 @@
           <w:pPr>
             <w:pStyle w:val="Verzeichnis2"/>
             <w:tabs>
-              <w:tab w:val="left" w:pos="880"/>
+              <w:tab w:val="left" w:pos="960"/>
               <w:tab w:val="right" w:leader="dot" w:pos="9062"/>
             </w:tabs>
             <w:rPr>
               <w:rFonts w:eastAsiaTheme="minorEastAsia"/>
               <w:noProof/>
               <w:kern w:val="2"/>
-              <w:lang w:eastAsia="en-GB"/>
+              <w:sz w:val="24"/>
+              <w:szCs w:val="24"/>
+              <w:lang w:val="de-AT" w:eastAsia="de-DE"/>
               <w14:ligatures w14:val="standardContextual"/>
             </w:rPr>
           </w:pPr>
-          <w:hyperlink w:anchor="_Toc146719135" w:history="1">
+          <w:hyperlink w:anchor="_Toc228104600" w:history="1">
             <w:r>
               <w:rPr>
                 <w:rStyle w:val="Hyperlink"/>
@@ -683,7 +705,9 @@
                 <w:rFonts w:eastAsiaTheme="minorEastAsia"/>
                 <w:noProof/>
                 <w:kern w:val="2"/>
-                <w:lang w:eastAsia="en-GB"/>
+                <w:sz w:val="24"/>
+                <w:szCs w:val="24"/>
+                <w:lang w:val="de-AT" w:eastAsia="de-DE"/>
                 <w14:ligatures w14:val="standardContextual"/>
               </w:rPr>
               <w:tab/>
@@ -714,7 +738,7 @@
                 <w:noProof/>
                 <w:webHidden/>
               </w:rPr>
-              <w:instrText xml:space="preserve"> PAGEREF _Toc146719135 \h </w:instrText>
+              <w:instrText xml:space="preserve"> PAGEREF _Toc228104600 \h </w:instrText>
             </w:r>
             <w:r>
               <w:rPr>
@@ -749,18 +773,20 @@
           <w:pPr>
             <w:pStyle w:val="Verzeichnis2"/>
             <w:tabs>
-              <w:tab w:val="left" w:pos="880"/>
+              <w:tab w:val="left" w:pos="960"/>
               <w:tab w:val="right" w:leader="dot" w:pos="9062"/>
             </w:tabs>
             <w:rPr>
               <w:rFonts w:eastAsiaTheme="minorEastAsia"/>
               <w:noProof/>
               <w:kern w:val="2"/>
-              <w:lang w:eastAsia="en-GB"/>
+              <w:sz w:val="24"/>
+              <w:szCs w:val="24"/>
+              <w:lang w:val="de-AT" w:eastAsia="de-DE"/>
               <w14:ligatures w14:val="standardContextual"/>
             </w:rPr>
           </w:pPr>
-          <w:hyperlink w:anchor="_Toc146719136" w:history="1">
+          <w:hyperlink w:anchor="_Toc228104601" w:history="1">
             <w:r>
               <w:rPr>
                 <w:rStyle w:val="Hyperlink"/>
@@ -773,7 +799,9 @@
                 <w:rFonts w:eastAsiaTheme="minorEastAsia"/>
                 <w:noProof/>
                 <w:kern w:val="2"/>
-                <w:lang w:eastAsia="en-GB"/>
+                <w:sz w:val="24"/>
+                <w:szCs w:val="24"/>
+                <w:lang w:val="de-AT" w:eastAsia="de-DE"/>
                 <w14:ligatures w14:val="standardContextual"/>
               </w:rPr>
               <w:tab/>
@@ -804,7 +832,7 @@
                 <w:noProof/>
                 <w:webHidden/>
               </w:rPr>
-              <w:instrText xml:space="preserve"> PAGEREF _Toc146719136 \h </w:instrText>
+              <w:instrText xml:space="preserve"> PAGEREF _Toc228104601 \h </w:instrText>
             </w:r>
             <w:r>
               <w:rPr>
@@ -839,18 +867,20 @@
           <w:pPr>
             <w:pStyle w:val="Verzeichnis2"/>
             <w:tabs>
-              <w:tab w:val="left" w:pos="880"/>
+              <w:tab w:val="left" w:pos="960"/>
               <w:tab w:val="right" w:leader="dot" w:pos="9062"/>
             </w:tabs>
             <w:rPr>
               <w:rFonts w:eastAsiaTheme="minorEastAsia"/>
               <w:noProof/>
               <w:kern w:val="2"/>
-              <w:lang w:eastAsia="en-GB"/>
+              <w:sz w:val="24"/>
+              <w:szCs w:val="24"/>
+              <w:lang w:val="de-AT" w:eastAsia="de-DE"/>
               <w14:ligatures w14:val="standardContextual"/>
             </w:rPr>
           </w:pPr>
-          <w:hyperlink w:anchor="_Toc146719137" w:history="1">
+          <w:hyperlink w:anchor="_Toc228104602" w:history="1">
             <w:r>
               <w:rPr>
                 <w:rStyle w:val="Hyperlink"/>
@@ -863,7 +893,9 @@
                 <w:rFonts w:eastAsiaTheme="minorEastAsia"/>
                 <w:noProof/>
                 <w:kern w:val="2"/>
-                <w:lang w:eastAsia="en-GB"/>
+                <w:sz w:val="24"/>
+                <w:szCs w:val="24"/>
+                <w:lang w:val="de-AT" w:eastAsia="de-DE"/>
                 <w14:ligatures w14:val="standardContextual"/>
               </w:rPr>
               <w:tab/>
@@ -894,7 +926,7 @@
                 <w:noProof/>
                 <w:webHidden/>
               </w:rPr>
-              <w:instrText xml:space="preserve"> PAGEREF _Toc146719137 \h </w:instrText>
+              <w:instrText xml:space="preserve"> PAGEREF _Toc228104602 \h </w:instrText>
             </w:r>
             <w:r>
               <w:rPr>
@@ -936,11 +968,13 @@
               <w:rFonts w:eastAsiaTheme="minorEastAsia"/>
               <w:noProof/>
               <w:kern w:val="2"/>
-              <w:lang w:eastAsia="en-GB"/>
+              <w:sz w:val="24"/>
+              <w:szCs w:val="24"/>
+              <w:lang w:val="de-AT" w:eastAsia="de-DE"/>
               <w14:ligatures w14:val="standardContextual"/>
             </w:rPr>
           </w:pPr>
-          <w:hyperlink w:anchor="_Toc146719138" w:history="1">
+          <w:hyperlink w:anchor="_Toc228104603" w:history="1">
             <w:r>
               <w:rPr>
                 <w:rStyle w:val="Hyperlink"/>
@@ -953,7 +987,9 @@
                 <w:rFonts w:eastAsiaTheme="minorEastAsia"/>
                 <w:noProof/>
                 <w:kern w:val="2"/>
-                <w:lang w:eastAsia="en-GB"/>
+                <w:sz w:val="24"/>
+                <w:szCs w:val="24"/>
+                <w:lang w:val="de-AT" w:eastAsia="de-DE"/>
                 <w14:ligatures w14:val="standardContextual"/>
               </w:rPr>
               <w:tab/>
@@ -984,7 +1020,7 @@
                 <w:noProof/>
                 <w:webHidden/>
               </w:rPr>
-              <w:instrText xml:space="preserve"> PAGEREF _Toc146719138 \h </w:instrText>
+              <w:instrText xml:space="preserve"> PAGEREF _Toc228104603 \h </w:instrText>
             </w:r>
             <w:r>
               <w:rPr>
@@ -1019,18 +1055,20 @@
           <w:pPr>
             <w:pStyle w:val="Verzeichnis2"/>
             <w:tabs>
-              <w:tab w:val="left" w:pos="880"/>
+              <w:tab w:val="left" w:pos="960"/>
               <w:tab w:val="right" w:leader="dot" w:pos="9062"/>
             </w:tabs>
             <w:rPr>
               <w:rFonts w:eastAsiaTheme="minorEastAsia"/>
               <w:noProof/>
               <w:kern w:val="2"/>
-              <w:lang w:eastAsia="en-GB"/>
+              <w:sz w:val="24"/>
+              <w:szCs w:val="24"/>
+              <w:lang w:val="de-AT" w:eastAsia="de-DE"/>
               <w14:ligatures w14:val="standardContextual"/>
             </w:rPr>
           </w:pPr>
-          <w:hyperlink w:anchor="_Toc146719139" w:history="1">
+          <w:hyperlink w:anchor="_Toc228104604" w:history="1">
             <w:r>
               <w:rPr>
                 <w:rStyle w:val="Hyperlink"/>
@@ -1043,7 +1081,9 @@
                 <w:rFonts w:eastAsiaTheme="minorEastAsia"/>
                 <w:noProof/>
                 <w:kern w:val="2"/>
-                <w:lang w:eastAsia="en-GB"/>
+                <w:sz w:val="24"/>
+                <w:szCs w:val="24"/>
+                <w:lang w:val="de-AT" w:eastAsia="de-DE"/>
                 <w14:ligatures w14:val="standardContextual"/>
               </w:rPr>
               <w:tab/>
@@ -1074,7 +1114,7 @@
                 <w:noProof/>
                 <w:webHidden/>
               </w:rPr>
-              <w:instrText xml:space="preserve"> PAGEREF _Toc146719139 \h </w:instrText>
+              <w:instrText xml:space="preserve"> PAGEREF _Toc228104604 \h </w:instrText>
             </w:r>
             <w:r>
               <w:rPr>
@@ -1109,18 +1149,20 @@
           <w:pPr>
             <w:pStyle w:val="Verzeichnis2"/>
             <w:tabs>
-              <w:tab w:val="left" w:pos="880"/>
+              <w:tab w:val="left" w:pos="960"/>
               <w:tab w:val="right" w:leader="dot" w:pos="9062"/>
             </w:tabs>
             <w:rPr>
               <w:rFonts w:eastAsiaTheme="minorEastAsia"/>
               <w:noProof/>
               <w:kern w:val="2"/>
-              <w:lang w:eastAsia="en-GB"/>
+              <w:sz w:val="24"/>
+              <w:szCs w:val="24"/>
+              <w:lang w:val="de-AT" w:eastAsia="de-DE"/>
               <w14:ligatures w14:val="standardContextual"/>
             </w:rPr>
           </w:pPr>
-          <w:hyperlink w:anchor="_Toc146719140" w:history="1">
+          <w:hyperlink w:anchor="_Toc228104605" w:history="1">
             <w:r>
               <w:rPr>
                 <w:rStyle w:val="Hyperlink"/>
@@ -1133,7 +1175,9 @@
                 <w:rFonts w:eastAsiaTheme="minorEastAsia"/>
                 <w:noProof/>
                 <w:kern w:val="2"/>
-                <w:lang w:eastAsia="en-GB"/>
+                <w:sz w:val="24"/>
+                <w:szCs w:val="24"/>
+                <w:lang w:val="de-AT" w:eastAsia="de-DE"/>
                 <w14:ligatures w14:val="standardContextual"/>
               </w:rPr>
               <w:tab/>
@@ -1164,7 +1208,7 @@
                 <w:noProof/>
                 <w:webHidden/>
               </w:rPr>
-              <w:instrText xml:space="preserve"> PAGEREF _Toc146719140 \h </w:instrText>
+              <w:instrText xml:space="preserve"> PAGEREF _Toc228104605 \h </w:instrText>
             </w:r>
             <w:r>
               <w:rPr>
@@ -1199,18 +1243,20 @@
           <w:pPr>
             <w:pStyle w:val="Verzeichnis2"/>
             <w:tabs>
-              <w:tab w:val="left" w:pos="880"/>
+              <w:tab w:val="left" w:pos="960"/>
               <w:tab w:val="right" w:leader="dot" w:pos="9062"/>
             </w:tabs>
             <w:rPr>
               <w:rFonts w:eastAsiaTheme="minorEastAsia"/>
               <w:noProof/>
               <w:kern w:val="2"/>
-              <w:lang w:eastAsia="en-GB"/>
+              <w:sz w:val="24"/>
+              <w:szCs w:val="24"/>
+              <w:lang w:val="de-AT" w:eastAsia="de-DE"/>
               <w14:ligatures w14:val="standardContextual"/>
             </w:rPr>
           </w:pPr>
-          <w:hyperlink w:anchor="_Toc146719141" w:history="1">
+          <w:hyperlink w:anchor="_Toc228104606" w:history="1">
             <w:r>
               <w:rPr>
                 <w:rStyle w:val="Hyperlink"/>
@@ -1223,7 +1269,9 @@
                 <w:rFonts w:eastAsiaTheme="minorEastAsia"/>
                 <w:noProof/>
                 <w:kern w:val="2"/>
-                <w:lang w:eastAsia="en-GB"/>
+                <w:sz w:val="24"/>
+                <w:szCs w:val="24"/>
+                <w:lang w:val="de-AT" w:eastAsia="de-DE"/>
                 <w14:ligatures w14:val="standardContextual"/>
               </w:rPr>
               <w:tab/>
@@ -1254,7 +1302,7 @@
                 <w:noProof/>
                 <w:webHidden/>
               </w:rPr>
-              <w:instrText xml:space="preserve"> PAGEREF _Toc146719141 \h </w:instrText>
+              <w:instrText xml:space="preserve"> PAGEREF _Toc228104606 \h </w:instrText>
             </w:r>
             <w:r>
               <w:rPr>
@@ -1289,18 +1337,20 @@
           <w:pPr>
             <w:pStyle w:val="Verzeichnis3"/>
             <w:tabs>
-              <w:tab w:val="left" w:pos="1320"/>
+              <w:tab w:val="left" w:pos="1200"/>
               <w:tab w:val="right" w:leader="dot" w:pos="9062"/>
             </w:tabs>
             <w:rPr>
               <w:rFonts w:eastAsiaTheme="minorEastAsia"/>
               <w:noProof/>
               <w:kern w:val="2"/>
-              <w:lang w:eastAsia="en-GB"/>
+              <w:sz w:val="24"/>
+              <w:szCs w:val="24"/>
+              <w:lang w:val="de-AT" w:eastAsia="de-DE"/>
               <w14:ligatures w14:val="standardContextual"/>
             </w:rPr>
           </w:pPr>
-          <w:hyperlink w:anchor="_Toc146719142" w:history="1">
+          <w:hyperlink w:anchor="_Toc228104607" w:history="1">
             <w:r>
               <w:rPr>
                 <w:rStyle w:val="Hyperlink"/>
@@ -1313,7 +1363,9 @@
                 <w:rFonts w:eastAsiaTheme="minorEastAsia"/>
                 <w:noProof/>
                 <w:kern w:val="2"/>
-                <w:lang w:eastAsia="en-GB"/>
+                <w:sz w:val="24"/>
+                <w:szCs w:val="24"/>
+                <w:lang w:val="de-AT" w:eastAsia="de-DE"/>
                 <w14:ligatures w14:val="standardContextual"/>
               </w:rPr>
               <w:tab/>
@@ -1344,7 +1396,7 @@
                 <w:noProof/>
                 <w:webHidden/>
               </w:rPr>
-              <w:instrText xml:space="preserve"> PAGEREF _Toc146719142 \h </w:instrText>
+              <w:instrText xml:space="preserve"> PAGEREF _Toc228104607 \h </w:instrText>
             </w:r>
             <w:r>
               <w:rPr>
@@ -1379,18 +1431,20 @@
           <w:pPr>
             <w:pStyle w:val="Verzeichnis3"/>
             <w:tabs>
-              <w:tab w:val="left" w:pos="1320"/>
+              <w:tab w:val="left" w:pos="1200"/>
               <w:tab w:val="right" w:leader="dot" w:pos="9062"/>
             </w:tabs>
             <w:rPr>
               <w:rFonts w:eastAsiaTheme="minorEastAsia"/>
               <w:noProof/>
               <w:kern w:val="2"/>
-              <w:lang w:eastAsia="en-GB"/>
+              <w:sz w:val="24"/>
+              <w:szCs w:val="24"/>
+              <w:lang w:val="de-AT" w:eastAsia="de-DE"/>
               <w14:ligatures w14:val="standardContextual"/>
             </w:rPr>
           </w:pPr>
-          <w:hyperlink w:anchor="_Toc146719143" w:history="1">
+          <w:hyperlink w:anchor="_Toc228104608" w:history="1">
             <w:r>
               <w:rPr>
                 <w:rStyle w:val="Hyperlink"/>
@@ -1403,7 +1457,9 @@
                 <w:rFonts w:eastAsiaTheme="minorEastAsia"/>
                 <w:noProof/>
                 <w:kern w:val="2"/>
-                <w:lang w:eastAsia="en-GB"/>
+                <w:sz w:val="24"/>
+                <w:szCs w:val="24"/>
+                <w:lang w:val="de-AT" w:eastAsia="de-DE"/>
                 <w14:ligatures w14:val="standardContextual"/>
               </w:rPr>
               <w:tab/>
@@ -1434,7 +1490,7 @@
                 <w:noProof/>
                 <w:webHidden/>
               </w:rPr>
-              <w:instrText xml:space="preserve"> PAGEREF _Toc146719143 \h </w:instrText>
+              <w:instrText xml:space="preserve"> PAGEREF _Toc228104608 \h </w:instrText>
             </w:r>
             <w:r>
               <w:rPr>
@@ -1469,18 +1525,20 @@
           <w:pPr>
             <w:pStyle w:val="Verzeichnis3"/>
             <w:tabs>
-              <w:tab w:val="left" w:pos="1320"/>
+              <w:tab w:val="left" w:pos="1200"/>
               <w:tab w:val="right" w:leader="dot" w:pos="9062"/>
             </w:tabs>
             <w:rPr>
               <w:rFonts w:eastAsiaTheme="minorEastAsia"/>
               <w:noProof/>
               <w:kern w:val="2"/>
-              <w:lang w:eastAsia="en-GB"/>
+              <w:sz w:val="24"/>
+              <w:szCs w:val="24"/>
+              <w:lang w:val="de-AT" w:eastAsia="de-DE"/>
               <w14:ligatures w14:val="standardContextual"/>
             </w:rPr>
           </w:pPr>
-          <w:hyperlink w:anchor="_Toc146719144" w:history="1">
+          <w:hyperlink w:anchor="_Toc228104609" w:history="1">
             <w:r>
               <w:rPr>
                 <w:rStyle w:val="Hyperlink"/>
@@ -1493,7 +1551,9 @@
                 <w:rFonts w:eastAsiaTheme="minorEastAsia"/>
                 <w:noProof/>
                 <w:kern w:val="2"/>
-                <w:lang w:eastAsia="en-GB"/>
+                <w:sz w:val="24"/>
+                <w:szCs w:val="24"/>
+                <w:lang w:val="de-AT" w:eastAsia="de-DE"/>
                 <w14:ligatures w14:val="standardContextual"/>
               </w:rPr>
               <w:tab/>
@@ -1524,7 +1584,7 @@
                 <w:noProof/>
                 <w:webHidden/>
               </w:rPr>
-              <w:instrText xml:space="preserve"> PAGEREF _Toc146719144 \h </w:instrText>
+              <w:instrText xml:space="preserve"> PAGEREF _Toc228104609 \h </w:instrText>
             </w:r>
             <w:r>
               <w:rPr>
@@ -1559,18 +1619,20 @@
           <w:pPr>
             <w:pStyle w:val="Verzeichnis3"/>
             <w:tabs>
-              <w:tab w:val="left" w:pos="1320"/>
+              <w:tab w:val="left" w:pos="1200"/>
               <w:tab w:val="right" w:leader="dot" w:pos="9062"/>
             </w:tabs>
             <w:rPr>
               <w:rFonts w:eastAsiaTheme="minorEastAsia"/>
               <w:noProof/>
               <w:kern w:val="2"/>
-              <w:lang w:eastAsia="en-GB"/>
+              <w:sz w:val="24"/>
+              <w:szCs w:val="24"/>
+              <w:lang w:val="de-AT" w:eastAsia="de-DE"/>
               <w14:ligatures w14:val="standardContextual"/>
             </w:rPr>
           </w:pPr>
-          <w:hyperlink w:anchor="_Toc146719145" w:history="1">
+          <w:hyperlink w:anchor="_Toc228104610" w:history="1">
             <w:r>
               <w:rPr>
                 <w:rStyle w:val="Hyperlink"/>
@@ -1583,7 +1645,9 @@
                 <w:rFonts w:eastAsiaTheme="minorEastAsia"/>
                 <w:noProof/>
                 <w:kern w:val="2"/>
-                <w:lang w:eastAsia="en-GB"/>
+                <w:sz w:val="24"/>
+                <w:szCs w:val="24"/>
+                <w:lang w:val="de-AT" w:eastAsia="de-DE"/>
                 <w14:ligatures w14:val="standardContextual"/>
               </w:rPr>
               <w:tab/>
@@ -1614,7 +1678,7 @@
                 <w:noProof/>
                 <w:webHidden/>
               </w:rPr>
-              <w:instrText xml:space="preserve"> PAGEREF _Toc146719145 \h </w:instrText>
+              <w:instrText xml:space="preserve"> PAGEREF _Toc228104610 \h </w:instrText>
             </w:r>
             <w:r>
               <w:rPr>
@@ -1649,18 +1713,20 @@
           <w:pPr>
             <w:pStyle w:val="Verzeichnis2"/>
             <w:tabs>
-              <w:tab w:val="left" w:pos="880"/>
+              <w:tab w:val="left" w:pos="960"/>
               <w:tab w:val="right" w:leader="dot" w:pos="9062"/>
             </w:tabs>
             <w:rPr>
               <w:rFonts w:eastAsiaTheme="minorEastAsia"/>
               <w:noProof/>
               <w:kern w:val="2"/>
-              <w:lang w:eastAsia="en-GB"/>
+              <w:sz w:val="24"/>
+              <w:szCs w:val="24"/>
+              <w:lang w:val="de-AT" w:eastAsia="de-DE"/>
               <w14:ligatures w14:val="standardContextual"/>
             </w:rPr>
           </w:pPr>
-          <w:hyperlink w:anchor="_Toc146719146" w:history="1">
+          <w:hyperlink w:anchor="_Toc228104611" w:history="1">
             <w:r>
               <w:rPr>
                 <w:rStyle w:val="Hyperlink"/>
@@ -1673,7 +1739,9 @@
                 <w:rFonts w:eastAsiaTheme="minorEastAsia"/>
                 <w:noProof/>
                 <w:kern w:val="2"/>
-                <w:lang w:eastAsia="en-GB"/>
+                <w:sz w:val="24"/>
+                <w:szCs w:val="24"/>
+                <w:lang w:val="de-AT" w:eastAsia="de-DE"/>
                 <w14:ligatures w14:val="standardContextual"/>
               </w:rPr>
               <w:tab/>
@@ -1704,7 +1772,7 @@
                 <w:noProof/>
                 <w:webHidden/>
               </w:rPr>
-              <w:instrText xml:space="preserve"> PAGEREF _Toc146719146 \h </w:instrText>
+              <w:instrText xml:space="preserve"> PAGEREF _Toc228104611 \h </w:instrText>
             </w:r>
             <w:r>
               <w:rPr>
@@ -1739,18 +1807,20 @@
           <w:pPr>
             <w:pStyle w:val="Verzeichnis2"/>
             <w:tabs>
-              <w:tab w:val="left" w:pos="880"/>
+              <w:tab w:val="left" w:pos="960"/>
               <w:tab w:val="right" w:leader="dot" w:pos="9062"/>
             </w:tabs>
             <w:rPr>
               <w:rFonts w:eastAsiaTheme="minorEastAsia"/>
               <w:noProof/>
               <w:kern w:val="2"/>
-              <w:lang w:eastAsia="en-GB"/>
+              <w:sz w:val="24"/>
+              <w:szCs w:val="24"/>
+              <w:lang w:val="de-AT" w:eastAsia="de-DE"/>
               <w14:ligatures w14:val="standardContextual"/>
             </w:rPr>
           </w:pPr>
-          <w:hyperlink w:anchor="_Toc146719147" w:history="1">
+          <w:hyperlink w:anchor="_Toc228104612" w:history="1">
             <w:r>
               <w:rPr>
                 <w:rStyle w:val="Hyperlink"/>
@@ -1763,7 +1833,9 @@
                 <w:rFonts w:eastAsiaTheme="minorEastAsia"/>
                 <w:noProof/>
                 <w:kern w:val="2"/>
-                <w:lang w:eastAsia="en-GB"/>
+                <w:sz w:val="24"/>
+                <w:szCs w:val="24"/>
+                <w:lang w:val="de-AT" w:eastAsia="de-DE"/>
                 <w14:ligatures w14:val="standardContextual"/>
               </w:rPr>
               <w:tab/>
@@ -1794,7 +1866,7 @@
                 <w:noProof/>
                 <w:webHidden/>
               </w:rPr>
-              <w:instrText xml:space="preserve"> PAGEREF _Toc146719147 \h </w:instrText>
+              <w:instrText xml:space="preserve"> PAGEREF _Toc228104612 \h </w:instrText>
             </w:r>
             <w:r>
               <w:rPr>
@@ -1829,18 +1901,20 @@
           <w:pPr>
             <w:pStyle w:val="Verzeichnis3"/>
             <w:tabs>
-              <w:tab w:val="left" w:pos="1320"/>
+              <w:tab w:val="left" w:pos="1200"/>
               <w:tab w:val="right" w:leader="dot" w:pos="9062"/>
             </w:tabs>
             <w:rPr>
               <w:rFonts w:eastAsiaTheme="minorEastAsia"/>
               <w:noProof/>
               <w:kern w:val="2"/>
-              <w:lang w:eastAsia="en-GB"/>
+              <w:sz w:val="24"/>
+              <w:szCs w:val="24"/>
+              <w:lang w:val="de-AT" w:eastAsia="de-DE"/>
               <w14:ligatures w14:val="standardContextual"/>
             </w:rPr>
           </w:pPr>
-          <w:hyperlink w:anchor="_Toc146719148" w:history="1">
+          <w:hyperlink w:anchor="_Toc228104613" w:history="1">
             <w:r>
               <w:rPr>
                 <w:rStyle w:val="Hyperlink"/>
@@ -1853,7 +1927,9 @@
                 <w:rFonts w:eastAsiaTheme="minorEastAsia"/>
                 <w:noProof/>
                 <w:kern w:val="2"/>
-                <w:lang w:eastAsia="en-GB"/>
+                <w:sz w:val="24"/>
+                <w:szCs w:val="24"/>
+                <w:lang w:val="de-AT" w:eastAsia="de-DE"/>
                 <w14:ligatures w14:val="standardContextual"/>
               </w:rPr>
               <w:tab/>
@@ -1884,7 +1960,7 @@
                 <w:noProof/>
                 <w:webHidden/>
               </w:rPr>
-              <w:instrText xml:space="preserve"> PAGEREF _Toc146719148 \h </w:instrText>
+              <w:instrText xml:space="preserve"> PAGEREF _Toc228104613 \h </w:instrText>
             </w:r>
             <w:r>
               <w:rPr>
@@ -1919,18 +1995,20 @@
           <w:pPr>
             <w:pStyle w:val="Verzeichnis3"/>
             <w:tabs>
-              <w:tab w:val="left" w:pos="1320"/>
+              <w:tab w:val="left" w:pos="1200"/>
               <w:tab w:val="right" w:leader="dot" w:pos="9062"/>
             </w:tabs>
             <w:rPr>
               <w:rFonts w:eastAsiaTheme="minorEastAsia"/>
               <w:noProof/>
               <w:kern w:val="2"/>
-              <w:lang w:eastAsia="en-GB"/>
+              <w:sz w:val="24"/>
+              <w:szCs w:val="24"/>
+              <w:lang w:val="de-AT" w:eastAsia="de-DE"/>
               <w14:ligatures w14:val="standardContextual"/>
             </w:rPr>
           </w:pPr>
-          <w:hyperlink w:anchor="_Toc146719149" w:history="1">
+          <w:hyperlink w:anchor="_Toc228104614" w:history="1">
             <w:r>
               <w:rPr>
                 <w:rStyle w:val="Hyperlink"/>
@@ -1943,7 +2021,9 @@
                 <w:rFonts w:eastAsiaTheme="minorEastAsia"/>
                 <w:noProof/>
                 <w:kern w:val="2"/>
-                <w:lang w:eastAsia="en-GB"/>
+                <w:sz w:val="24"/>
+                <w:szCs w:val="24"/>
+                <w:lang w:val="de-AT" w:eastAsia="de-DE"/>
                 <w14:ligatures w14:val="standardContextual"/>
               </w:rPr>
               <w:tab/>
@@ -1974,7 +2054,7 @@
                 <w:noProof/>
                 <w:webHidden/>
               </w:rPr>
-              <w:instrText xml:space="preserve"> PAGEREF _Toc146719149 \h </w:instrText>
+              <w:instrText xml:space="preserve"> PAGEREF _Toc228104614 \h </w:instrText>
             </w:r>
             <w:r>
               <w:rPr>
@@ -2009,18 +2089,20 @@
           <w:pPr>
             <w:pStyle w:val="Verzeichnis3"/>
             <w:tabs>
-              <w:tab w:val="left" w:pos="1320"/>
+              <w:tab w:val="left" w:pos="1200"/>
               <w:tab w:val="right" w:leader="dot" w:pos="9062"/>
             </w:tabs>
             <w:rPr>
               <w:rFonts w:eastAsiaTheme="minorEastAsia"/>
               <w:noProof/>
               <w:kern w:val="2"/>
-              <w:lang w:eastAsia="en-GB"/>
+              <w:sz w:val="24"/>
+              <w:szCs w:val="24"/>
+              <w:lang w:val="de-AT" w:eastAsia="de-DE"/>
               <w14:ligatures w14:val="standardContextual"/>
             </w:rPr>
           </w:pPr>
-          <w:hyperlink w:anchor="_Toc146719150" w:history="1">
+          <w:hyperlink w:anchor="_Toc228104615" w:history="1">
             <w:r>
               <w:rPr>
                 <w:rStyle w:val="Hyperlink"/>
@@ -2033,7 +2115,9 @@
                 <w:rFonts w:eastAsiaTheme="minorEastAsia"/>
                 <w:noProof/>
                 <w:kern w:val="2"/>
-                <w:lang w:eastAsia="en-GB"/>
+                <w:sz w:val="24"/>
+                <w:szCs w:val="24"/>
+                <w:lang w:val="de-AT" w:eastAsia="de-DE"/>
                 <w14:ligatures w14:val="standardContextual"/>
               </w:rPr>
               <w:tab/>
@@ -2064,7 +2148,7 @@
                 <w:noProof/>
                 <w:webHidden/>
               </w:rPr>
-              <w:instrText xml:space="preserve"> PAGEREF _Toc146719150 \h </w:instrText>
+              <w:instrText xml:space="preserve"> PAGEREF _Toc228104615 \h </w:instrText>
             </w:r>
             <w:r>
               <w:rPr>
@@ -2099,18 +2183,20 @@
           <w:pPr>
             <w:pStyle w:val="Verzeichnis3"/>
             <w:tabs>
-              <w:tab w:val="left" w:pos="1320"/>
+              <w:tab w:val="left" w:pos="1200"/>
               <w:tab w:val="right" w:leader="dot" w:pos="9062"/>
             </w:tabs>
             <w:rPr>
               <w:rFonts w:eastAsiaTheme="minorEastAsia"/>
               <w:noProof/>
               <w:kern w:val="2"/>
-              <w:lang w:eastAsia="en-GB"/>
+              <w:sz w:val="24"/>
+              <w:szCs w:val="24"/>
+              <w:lang w:val="de-AT" w:eastAsia="de-DE"/>
               <w14:ligatures w14:val="standardContextual"/>
             </w:rPr>
           </w:pPr>
-          <w:hyperlink w:anchor="_Toc146719151" w:history="1">
+          <w:hyperlink w:anchor="_Toc228104616" w:history="1">
             <w:r>
               <w:rPr>
                 <w:rStyle w:val="Hyperlink"/>
@@ -2123,7 +2209,9 @@
                 <w:rFonts w:eastAsiaTheme="minorEastAsia"/>
                 <w:noProof/>
                 <w:kern w:val="2"/>
-                <w:lang w:eastAsia="en-GB"/>
+                <w:sz w:val="24"/>
+                <w:szCs w:val="24"/>
+                <w:lang w:val="de-AT" w:eastAsia="de-DE"/>
                 <w14:ligatures w14:val="standardContextual"/>
               </w:rPr>
               <w:tab/>
@@ -2154,7 +2242,7 @@
                 <w:noProof/>
                 <w:webHidden/>
               </w:rPr>
-              <w:instrText xml:space="preserve"> PAGEREF _Toc146719151 \h </w:instrText>
+              <w:instrText xml:space="preserve"> PAGEREF _Toc228104616 \h </w:instrText>
             </w:r>
             <w:r>
               <w:rPr>
@@ -2189,18 +2277,20 @@
           <w:pPr>
             <w:pStyle w:val="Verzeichnis3"/>
             <w:tabs>
-              <w:tab w:val="left" w:pos="1320"/>
+              <w:tab w:val="left" w:pos="1200"/>
               <w:tab w:val="right" w:leader="dot" w:pos="9062"/>
             </w:tabs>
             <w:rPr>
               <w:rFonts w:eastAsiaTheme="minorEastAsia"/>
               <w:noProof/>
               <w:kern w:val="2"/>
-              <w:lang w:eastAsia="en-GB"/>
+              <w:sz w:val="24"/>
+              <w:szCs w:val="24"/>
+              <w:lang w:val="de-AT" w:eastAsia="de-DE"/>
               <w14:ligatures w14:val="standardContextual"/>
             </w:rPr>
           </w:pPr>
-          <w:hyperlink w:anchor="_Toc146719152" w:history="1">
+          <w:hyperlink w:anchor="_Toc228104617" w:history="1">
             <w:r>
               <w:rPr>
                 <w:rStyle w:val="Hyperlink"/>
@@ -2213,7 +2303,9 @@
                 <w:rFonts w:eastAsiaTheme="minorEastAsia"/>
                 <w:noProof/>
                 <w:kern w:val="2"/>
-                <w:lang w:eastAsia="en-GB"/>
+                <w:sz w:val="24"/>
+                <w:szCs w:val="24"/>
+                <w:lang w:val="de-AT" w:eastAsia="de-DE"/>
                 <w14:ligatures w14:val="standardContextual"/>
               </w:rPr>
               <w:tab/>
@@ -2244,7 +2336,7 @@
                 <w:noProof/>
                 <w:webHidden/>
               </w:rPr>
-              <w:instrText xml:space="preserve"> PAGEREF _Toc146719152 \h </w:instrText>
+              <w:instrText xml:space="preserve"> PAGEREF _Toc228104617 \h </w:instrText>
             </w:r>
             <w:r>
               <w:rPr>
@@ -2279,18 +2371,20 @@
           <w:pPr>
             <w:pStyle w:val="Verzeichnis3"/>
             <w:tabs>
-              <w:tab w:val="left" w:pos="1320"/>
+              <w:tab w:val="left" w:pos="1200"/>
               <w:tab w:val="right" w:leader="dot" w:pos="9062"/>
             </w:tabs>
             <w:rPr>
               <w:rFonts w:eastAsiaTheme="minorEastAsia"/>
               <w:noProof/>
               <w:kern w:val="2"/>
-              <w:lang w:eastAsia="en-GB"/>
+              <w:sz w:val="24"/>
+              <w:szCs w:val="24"/>
+              <w:lang w:val="de-AT" w:eastAsia="de-DE"/>
               <w14:ligatures w14:val="standardContextual"/>
             </w:rPr>
           </w:pPr>
-          <w:hyperlink w:anchor="_Toc146719153" w:history="1">
+          <w:hyperlink w:anchor="_Toc228104618" w:history="1">
             <w:r>
               <w:rPr>
                 <w:rStyle w:val="Hyperlink"/>
@@ -2303,7 +2397,9 @@
                 <w:rFonts w:eastAsiaTheme="minorEastAsia"/>
                 <w:noProof/>
                 <w:kern w:val="2"/>
-                <w:lang w:eastAsia="en-GB"/>
+                <w:sz w:val="24"/>
+                <w:szCs w:val="24"/>
+                <w:lang w:val="de-AT" w:eastAsia="de-DE"/>
                 <w14:ligatures w14:val="standardContextual"/>
               </w:rPr>
               <w:tab/>
@@ -2334,7 +2430,7 @@
                 <w:noProof/>
                 <w:webHidden/>
               </w:rPr>
-              <w:instrText xml:space="preserve"> PAGEREF _Toc146719153 \h </w:instrText>
+              <w:instrText xml:space="preserve"> PAGEREF _Toc228104618 \h </w:instrText>
             </w:r>
             <w:r>
               <w:rPr>
@@ -2376,11 +2472,13 @@
               <w:rFonts w:eastAsiaTheme="minorEastAsia"/>
               <w:noProof/>
               <w:kern w:val="2"/>
-              <w:lang w:eastAsia="en-GB"/>
+              <w:sz w:val="24"/>
+              <w:szCs w:val="24"/>
+              <w:lang w:val="de-AT" w:eastAsia="de-DE"/>
               <w14:ligatures w14:val="standardContextual"/>
             </w:rPr>
           </w:pPr>
-          <w:hyperlink w:anchor="_Toc146719154" w:history="1">
+          <w:hyperlink w:anchor="_Toc228104619" w:history="1">
             <w:r>
               <w:rPr>
                 <w:rStyle w:val="Hyperlink"/>
@@ -2393,7 +2491,9 @@
                 <w:rFonts w:eastAsiaTheme="minorEastAsia"/>
                 <w:noProof/>
                 <w:kern w:val="2"/>
-                <w:lang w:eastAsia="en-GB"/>
+                <w:sz w:val="24"/>
+                <w:szCs w:val="24"/>
+                <w:lang w:val="de-AT" w:eastAsia="de-DE"/>
                 <w14:ligatures w14:val="standardContextual"/>
               </w:rPr>
               <w:tab/>
@@ -2424,7 +2524,7 @@
                 <w:noProof/>
                 <w:webHidden/>
               </w:rPr>
-              <w:instrText xml:space="preserve"> PAGEREF _Toc146719154 \h </w:instrText>
+              <w:instrText xml:space="preserve"> PAGEREF _Toc228104619 \h </w:instrText>
             </w:r>
             <w:r>
               <w:rPr>
@@ -2459,18 +2559,20 @@
           <w:pPr>
             <w:pStyle w:val="Verzeichnis2"/>
             <w:tabs>
-              <w:tab w:val="left" w:pos="880"/>
+              <w:tab w:val="left" w:pos="960"/>
               <w:tab w:val="right" w:leader="dot" w:pos="9062"/>
             </w:tabs>
             <w:rPr>
               <w:rFonts w:eastAsiaTheme="minorEastAsia"/>
               <w:noProof/>
               <w:kern w:val="2"/>
-              <w:lang w:eastAsia="en-GB"/>
+              <w:sz w:val="24"/>
+              <w:szCs w:val="24"/>
+              <w:lang w:val="de-AT" w:eastAsia="de-DE"/>
               <w14:ligatures w14:val="standardContextual"/>
             </w:rPr>
           </w:pPr>
-          <w:hyperlink w:anchor="_Toc146719155" w:history="1">
+          <w:hyperlink w:anchor="_Toc228104620" w:history="1">
             <w:r>
               <w:rPr>
                 <w:rStyle w:val="Hyperlink"/>
@@ -2483,7 +2585,9 @@
                 <w:rFonts w:eastAsiaTheme="minorEastAsia"/>
                 <w:noProof/>
                 <w:kern w:val="2"/>
-                <w:lang w:eastAsia="en-GB"/>
+                <w:sz w:val="24"/>
+                <w:szCs w:val="24"/>
+                <w:lang w:val="de-AT" w:eastAsia="de-DE"/>
                 <w14:ligatures w14:val="standardContextual"/>
               </w:rPr>
               <w:tab/>
@@ -2514,7 +2618,7 @@
                 <w:noProof/>
                 <w:webHidden/>
               </w:rPr>
-              <w:instrText xml:space="preserve"> PAGEREF _Toc146719155 \h </w:instrText>
+              <w:instrText xml:space="preserve"> PAGEREF _Toc228104620 \h </w:instrText>
             </w:r>
             <w:r>
               <w:rPr>
@@ -2549,18 +2653,20 @@
           <w:pPr>
             <w:pStyle w:val="Verzeichnis2"/>
             <w:tabs>
-              <w:tab w:val="left" w:pos="880"/>
+              <w:tab w:val="left" w:pos="960"/>
               <w:tab w:val="right" w:leader="dot" w:pos="9062"/>
             </w:tabs>
             <w:rPr>
               <w:rFonts w:eastAsiaTheme="minorEastAsia"/>
               <w:noProof/>
               <w:kern w:val="2"/>
-              <w:lang w:eastAsia="en-GB"/>
+              <w:sz w:val="24"/>
+              <w:szCs w:val="24"/>
+              <w:lang w:val="de-AT" w:eastAsia="de-DE"/>
               <w14:ligatures w14:val="standardContextual"/>
             </w:rPr>
           </w:pPr>
-          <w:hyperlink w:anchor="_Toc146719156" w:history="1">
+          <w:hyperlink w:anchor="_Toc228104621" w:history="1">
             <w:r>
               <w:rPr>
                 <w:rStyle w:val="Hyperlink"/>
@@ -2573,7 +2679,9 @@
                 <w:rFonts w:eastAsiaTheme="minorEastAsia"/>
                 <w:noProof/>
                 <w:kern w:val="2"/>
-                <w:lang w:eastAsia="en-GB"/>
+                <w:sz w:val="24"/>
+                <w:szCs w:val="24"/>
+                <w:lang w:val="de-AT" w:eastAsia="de-DE"/>
                 <w14:ligatures w14:val="standardContextual"/>
               </w:rPr>
               <w:tab/>
@@ -2604,7 +2712,7 @@
                 <w:noProof/>
                 <w:webHidden/>
               </w:rPr>
-              <w:instrText xml:space="preserve"> PAGEREF _Toc146719156 \h </w:instrText>
+              <w:instrText xml:space="preserve"> PAGEREF _Toc228104621 \h </w:instrText>
             </w:r>
             <w:r>
               <w:rPr>
@@ -2639,18 +2747,20 @@
           <w:pPr>
             <w:pStyle w:val="Verzeichnis2"/>
             <w:tabs>
-              <w:tab w:val="left" w:pos="880"/>
+              <w:tab w:val="left" w:pos="960"/>
               <w:tab w:val="right" w:leader="dot" w:pos="9062"/>
             </w:tabs>
             <w:rPr>
               <w:rFonts w:eastAsiaTheme="minorEastAsia"/>
               <w:noProof/>
               <w:kern w:val="2"/>
-              <w:lang w:eastAsia="en-GB"/>
+              <w:sz w:val="24"/>
+              <w:szCs w:val="24"/>
+              <w:lang w:val="de-AT" w:eastAsia="de-DE"/>
               <w14:ligatures w14:val="standardContextual"/>
             </w:rPr>
           </w:pPr>
-          <w:hyperlink w:anchor="_Toc146719157" w:history="1">
+          <w:hyperlink w:anchor="_Toc228104622" w:history="1">
             <w:r>
               <w:rPr>
                 <w:rStyle w:val="Hyperlink"/>
@@ -2663,7 +2773,9 @@
                 <w:rFonts w:eastAsiaTheme="minorEastAsia"/>
                 <w:noProof/>
                 <w:kern w:val="2"/>
-                <w:lang w:eastAsia="en-GB"/>
+                <w:sz w:val="24"/>
+                <w:szCs w:val="24"/>
+                <w:lang w:val="de-AT" w:eastAsia="de-DE"/>
                 <w14:ligatures w14:val="standardContextual"/>
               </w:rPr>
               <w:tab/>
@@ -2694,7 +2806,7 @@
                 <w:noProof/>
                 <w:webHidden/>
               </w:rPr>
-              <w:instrText xml:space="preserve"> PAGEREF _Toc146719157 \h </w:instrText>
+              <w:instrText xml:space="preserve"> PAGEREF _Toc228104622 \h </w:instrText>
             </w:r>
             <w:r>
               <w:rPr>
@@ -2729,18 +2841,20 @@
           <w:pPr>
             <w:pStyle w:val="Verzeichnis3"/>
             <w:tabs>
-              <w:tab w:val="left" w:pos="1320"/>
+              <w:tab w:val="left" w:pos="1200"/>
               <w:tab w:val="right" w:leader="dot" w:pos="9062"/>
             </w:tabs>
             <w:rPr>
               <w:rFonts w:eastAsiaTheme="minorEastAsia"/>
               <w:noProof/>
               <w:kern w:val="2"/>
-              <w:lang w:eastAsia="en-GB"/>
+              <w:sz w:val="24"/>
+              <w:szCs w:val="24"/>
+              <w:lang w:val="de-AT" w:eastAsia="de-DE"/>
               <w14:ligatures w14:val="standardContextual"/>
             </w:rPr>
           </w:pPr>
-          <w:hyperlink w:anchor="_Toc146719158" w:history="1">
+          <w:hyperlink w:anchor="_Toc228104623" w:history="1">
             <w:r>
               <w:rPr>
                 <w:rStyle w:val="Hyperlink"/>
@@ -2753,7 +2867,9 @@
                 <w:rFonts w:eastAsiaTheme="minorEastAsia"/>
                 <w:noProof/>
                 <w:kern w:val="2"/>
-                <w:lang w:eastAsia="en-GB"/>
+                <w:sz w:val="24"/>
+                <w:szCs w:val="24"/>
+                <w:lang w:val="de-AT" w:eastAsia="de-DE"/>
                 <w14:ligatures w14:val="standardContextual"/>
               </w:rPr>
               <w:tab/>
@@ -2784,7 +2900,7 @@
                 <w:noProof/>
                 <w:webHidden/>
               </w:rPr>
-              <w:instrText xml:space="preserve"> PAGEREF _Toc146719158 \h </w:instrText>
+              <w:instrText xml:space="preserve"> PAGEREF _Toc228104623 \h </w:instrText>
             </w:r>
             <w:r>
               <w:rPr>
@@ -2819,18 +2935,20 @@
           <w:pPr>
             <w:pStyle w:val="Verzeichnis3"/>
             <w:tabs>
-              <w:tab w:val="left" w:pos="1320"/>
+              <w:tab w:val="left" w:pos="1200"/>
               <w:tab w:val="right" w:leader="dot" w:pos="9062"/>
             </w:tabs>
             <w:rPr>
               <w:rFonts w:eastAsiaTheme="minorEastAsia"/>
               <w:noProof/>
               <w:kern w:val="2"/>
-              <w:lang w:eastAsia="en-GB"/>
+              <w:sz w:val="24"/>
+              <w:szCs w:val="24"/>
+              <w:lang w:val="de-AT" w:eastAsia="de-DE"/>
               <w14:ligatures w14:val="standardContextual"/>
             </w:rPr>
           </w:pPr>
-          <w:hyperlink w:anchor="_Toc146719159" w:history="1">
+          <w:hyperlink w:anchor="_Toc228104624" w:history="1">
             <w:r>
               <w:rPr>
                 <w:rStyle w:val="Hyperlink"/>
@@ -2843,7 +2961,9 @@
                 <w:rFonts w:eastAsiaTheme="minorEastAsia"/>
                 <w:noProof/>
                 <w:kern w:val="2"/>
-                <w:lang w:eastAsia="en-GB"/>
+                <w:sz w:val="24"/>
+                <w:szCs w:val="24"/>
+                <w:lang w:val="de-AT" w:eastAsia="de-DE"/>
                 <w14:ligatures w14:val="standardContextual"/>
               </w:rPr>
               <w:tab/>
@@ -2874,7 +2994,7 @@
                 <w:noProof/>
                 <w:webHidden/>
               </w:rPr>
-              <w:instrText xml:space="preserve"> PAGEREF _Toc146719159 \h </w:instrText>
+              <w:instrText xml:space="preserve"> PAGEREF _Toc228104624 \h </w:instrText>
             </w:r>
             <w:r>
               <w:rPr>
@@ -2909,18 +3029,20 @@
           <w:pPr>
             <w:pStyle w:val="Verzeichnis3"/>
             <w:tabs>
-              <w:tab w:val="left" w:pos="1320"/>
+              <w:tab w:val="left" w:pos="1200"/>
               <w:tab w:val="right" w:leader="dot" w:pos="9062"/>
             </w:tabs>
             <w:rPr>
               <w:rFonts w:eastAsiaTheme="minorEastAsia"/>
               <w:noProof/>
               <w:kern w:val="2"/>
-              <w:lang w:eastAsia="en-GB"/>
+              <w:sz w:val="24"/>
+              <w:szCs w:val="24"/>
+              <w:lang w:val="de-AT" w:eastAsia="de-DE"/>
               <w14:ligatures w14:val="standardContextual"/>
             </w:rPr>
           </w:pPr>
-          <w:hyperlink w:anchor="_Toc146719160" w:history="1">
+          <w:hyperlink w:anchor="_Toc228104625" w:history="1">
             <w:r>
               <w:rPr>
                 <w:rStyle w:val="Hyperlink"/>
@@ -2933,7 +3055,9 @@
                 <w:rFonts w:eastAsiaTheme="minorEastAsia"/>
                 <w:noProof/>
                 <w:kern w:val="2"/>
-                <w:lang w:eastAsia="en-GB"/>
+                <w:sz w:val="24"/>
+                <w:szCs w:val="24"/>
+                <w:lang w:val="de-AT" w:eastAsia="de-DE"/>
                 <w14:ligatures w14:val="standardContextual"/>
               </w:rPr>
               <w:tab/>
@@ -2964,7 +3088,7 @@
                 <w:noProof/>
                 <w:webHidden/>
               </w:rPr>
-              <w:instrText xml:space="preserve"> PAGEREF _Toc146719160 \h </w:instrText>
+              <w:instrText xml:space="preserve"> PAGEREF _Toc228104625 \h </w:instrText>
             </w:r>
             <w:r>
               <w:rPr>
@@ -3006,11 +3130,13 @@
               <w:rFonts w:eastAsiaTheme="minorEastAsia"/>
               <w:noProof/>
               <w:kern w:val="2"/>
-              <w:lang w:eastAsia="en-GB"/>
+              <w:sz w:val="24"/>
+              <w:szCs w:val="24"/>
+              <w:lang w:val="de-AT" w:eastAsia="de-DE"/>
               <w14:ligatures w14:val="standardContextual"/>
             </w:rPr>
           </w:pPr>
-          <w:hyperlink w:anchor="_Toc146719161" w:history="1">
+          <w:hyperlink w:anchor="_Toc228104626" w:history="1">
             <w:r>
               <w:rPr>
                 <w:rStyle w:val="Hyperlink"/>
@@ -3023,7 +3149,9 @@
                 <w:rFonts w:eastAsiaTheme="minorEastAsia"/>
                 <w:noProof/>
                 <w:kern w:val="2"/>
-                <w:lang w:eastAsia="en-GB"/>
+                <w:sz w:val="24"/>
+                <w:szCs w:val="24"/>
+                <w:lang w:val="de-AT" w:eastAsia="de-DE"/>
                 <w14:ligatures w14:val="standardContextual"/>
               </w:rPr>
               <w:tab/>
@@ -3054,7 +3182,7 @@
                 <w:noProof/>
                 <w:webHidden/>
               </w:rPr>
-              <w:instrText xml:space="preserve"> PAGEREF _Toc146719161 \h </w:instrText>
+              <w:instrText xml:space="preserve"> PAGEREF _Toc228104626 \h </w:instrText>
             </w:r>
             <w:r>
               <w:rPr>
@@ -3334,7 +3462,7 @@
       <w:pPr>
         <w:pStyle w:val="berschrift1"/>
       </w:pPr>
-      <w:bookmarkStart w:id="0" w:name="_Toc146719130"/>
+      <w:bookmarkStart w:id="0" w:name="_Toc228104595"/>
       <w:r>
         <w:lastRenderedPageBreak/>
         <w:t>Introduction</w:t>
@@ -3355,15 +3483,7 @@
         <w:t>Peppol</w:t>
       </w:r>
       <w:r>
-        <w:t xml:space="preserve"> network. The intended audience for this document </w:t>
-      </w:r>
-      <w:proofErr w:type="gramStart"/>
-      <w:r>
-        <w:t>are</w:t>
-      </w:r>
-      <w:proofErr w:type="gramEnd"/>
-      <w:r>
-        <w:t xml:space="preserve"> technical experts that want to setup their own SMP</w:t>
+        <w:t xml:space="preserve"> network. The intended audience for this document are technical experts that want to setup their own SMP</w:t>
       </w:r>
       <w:r>
         <w:t xml:space="preserve"> for Peppol usage</w:t>
@@ -3410,7 +3530,7 @@
       <w:pPr>
         <w:pStyle w:val="berschrift2"/>
       </w:pPr>
-      <w:bookmarkStart w:id="1" w:name="_Toc146719131"/>
+      <w:bookmarkStart w:id="1" w:name="_Toc228104596"/>
       <w:r>
         <w:t>Terminology</w:t>
       </w:r>
@@ -3446,7 +3566,7 @@
       <w:pPr>
         <w:pStyle w:val="berschrift2"/>
       </w:pPr>
-      <w:bookmarkStart w:id="2" w:name="_Toc146719132"/>
+      <w:bookmarkStart w:id="2" w:name="_Toc228104597"/>
       <w:r>
         <w:t>Bibliography</w:t>
       </w:r>
@@ -3525,43 +3645,7 @@
         <w:t>Peppol</w:t>
       </w:r>
       <w:r>
-        <w:t xml:space="preserve"> Policy for the use of identifiers, v</w:t>
-      </w:r>
-      <w:r>
-        <w:t>4</w:t>
-      </w:r>
-      <w:r>
-        <w:t>.</w:t>
-      </w:r>
-      <w:r>
-        <w:t>2</w:t>
-      </w:r>
-      <w:r>
-        <w:t>.0, 2</w:t>
-      </w:r>
-      <w:r>
-        <w:t>0</w:t>
-      </w:r>
-      <w:r>
-        <w:t>2</w:t>
-      </w:r>
-      <w:r>
-        <w:t>3</w:t>
-      </w:r>
-      <w:r>
-        <w:t>-</w:t>
-      </w:r>
-      <w:r>
-        <w:t>06</w:t>
-      </w:r>
-      <w:r>
-        <w:t>-</w:t>
-      </w:r>
-      <w:r>
-        <w:t>19</w:t>
-      </w:r>
-      <w:r>
-        <w:t>,</w:t>
+        <w:t xml:space="preserve"> Policy for the use of identifiers,</w:t>
       </w:r>
       <w:r>
         <w:br/>
@@ -3571,7 +3655,7 @@
           <w:rPr>
             <w:rStyle w:val="Hyperlink"/>
           </w:rPr>
-          <w:t>https://docs.peppol.eu/edelivery/policies/PEPPOL-EDN-Policy-for-use-of-identifiers-4.2.0-2023-06-19.pdf</w:t>
+          <w:t>https://docs.peppol.eu/edelivery/</w:t>
         </w:r>
       </w:hyperlink>
     </w:p>
@@ -3616,28 +3700,7 @@
         <w:t>Peppol</w:t>
       </w:r>
       <w:r>
-        <w:t xml:space="preserve"> Policy for Transport Security, v1.</w:t>
-      </w:r>
-      <w:r>
-        <w:t>1</w:t>
-      </w:r>
-      <w:r>
-        <w:t>.0, 20</w:t>
-      </w:r>
-      <w:r>
-        <w:t>21</w:t>
-      </w:r>
-      <w:r>
-        <w:t>-</w:t>
-      </w:r>
-      <w:r>
-        <w:t>12</w:t>
-      </w:r>
-      <w:r>
-        <w:t>-</w:t>
-      </w:r>
-      <w:r>
-        <w:t>10</w:t>
+        <w:t xml:space="preserve"> Policy for Transport Security</w:t>
       </w:r>
       <w:r>
         <w:t>,</w:t>
@@ -3650,7 +3713,7 @@
           <w:rPr>
             <w:rStyle w:val="Hyperlink"/>
           </w:rPr>
-          <w:t>https://docs.peppol.eu/edelivery/policies/PEPPOL-EDN-Policy-for-Transport-Security-1.1.0-2020-04-20.pdf</w:t>
+          <w:t>https://docs.peppol.eu/edelivery/</w:t>
         </w:r>
       </w:hyperlink>
     </w:p>
@@ -3658,7 +3721,7 @@
       <w:pPr>
         <w:pStyle w:val="berschrift1"/>
       </w:pPr>
-      <w:bookmarkStart w:id="7" w:name="_Toc146719133"/>
+      <w:bookmarkStart w:id="7" w:name="_Toc228104598"/>
       <w:r>
         <w:lastRenderedPageBreak/>
         <w:t>Prerequisites</w:t>
@@ -3689,7 +3752,7 @@
       <w:pPr>
         <w:pStyle w:val="berschrift2"/>
       </w:pPr>
-      <w:bookmarkStart w:id="8" w:name="_Toc146719134"/>
+      <w:bookmarkStart w:id="8" w:name="_Toc228104599"/>
       <w:r>
         <w:t>Hardware minimum requirements</w:t>
       </w:r>
@@ -3764,7 +3827,7 @@
       <w:pPr>
         <w:pStyle w:val="berschrift2"/>
       </w:pPr>
-      <w:bookmarkStart w:id="9" w:name="_Toc146719135"/>
+      <w:bookmarkStart w:id="9" w:name="_Toc228104600"/>
       <w:r>
         <w:t>Software minimum requirements</w:t>
       </w:r>
@@ -3782,22 +3845,20 @@
         <w:t xml:space="preserve">Java </w:t>
       </w:r>
       <w:r>
-        <w:t>11</w:t>
+        <w:t>1</w:t>
+      </w:r>
+      <w:r>
+        <w:t>7</w:t>
       </w:r>
       <w:r>
         <w:t xml:space="preserve"> or newer</w:t>
       </w:r>
       <w:r>
-        <w:t xml:space="preserve"> – it was tested with </w:t>
-      </w:r>
-      <w:proofErr w:type="spellStart"/>
-      <w:r>
-        <w:t>Adopt</w:t>
+        <w:t xml:space="preserve"> – it was tested with Adopt</w:t>
       </w:r>
       <w:r>
         <w:t>ium</w:t>
       </w:r>
-      <w:proofErr w:type="spellEnd"/>
       <w:r>
         <w:t>, Open JDK and Oracle JDK</w:t>
       </w:r>
@@ -3820,15 +3881,20 @@
         <w:t>.</w:t>
       </w:r>
       <w:r>
+        <w:t>1.</w:t>
+      </w:r>
+      <w:r>
         <w:t>x</w:t>
       </w:r>
       <w:r>
+        <w:t xml:space="preserve"> or later</w:t>
+      </w:r>
+      <w:r>
         <w:t xml:space="preserve"> is recommended as </w:t>
       </w:r>
       <w:r>
         <w:t xml:space="preserve">the </w:t>
       </w:r>
-      <w:proofErr w:type="spellStart"/>
       <w:r>
         <w:t>Ja</w:t>
       </w:r>
@@ -3836,11 +3902,10 @@
         <w:t>karta</w:t>
       </w:r>
       <w:r>
-        <w:t>EE</w:t>
-      </w:r>
-      <w:proofErr w:type="spellEnd"/>
-      <w:r>
-        <w:t xml:space="preserve"> </w:t>
+        <w:t xml:space="preserve">EE </w:t>
+      </w:r>
+      <w:r>
+        <w:t xml:space="preserve">10 </w:t>
       </w:r>
       <w:r>
         <w:t>application server</w:t>
@@ -3849,16 +3914,17 @@
         <w:t xml:space="preserve"> – the SMP also works knowingly with Jetty </w:t>
       </w:r>
       <w:r>
-        <w:t xml:space="preserve">11.x </w:t>
-      </w:r>
-      <w:r>
-        <w:t xml:space="preserve">and </w:t>
-      </w:r>
-      <w:proofErr w:type="spellStart"/>
-      <w:r>
-        <w:t>WildFly</w:t>
-      </w:r>
-      <w:proofErr w:type="spellEnd"/>
+        <w:t>1</w:t>
+      </w:r>
+      <w:r>
+        <w:t>2</w:t>
+      </w:r>
+      <w:r>
+        <w:t xml:space="preserve">.x </w:t>
+      </w:r>
+      <w:r>
+        <w:t>and WildFly</w:t>
+      </w:r>
     </w:p>
     <w:p>
       <w:pPr>
@@ -3874,9 +3940,6 @@
       <w:r>
         <w:t xml:space="preserve"> for TLS handling</w:t>
       </w:r>
-      <w:r>
-        <w:t xml:space="preserve"> (for certain URL patterns only)</w:t>
-      </w:r>
     </w:p>
     <w:p>
       <w:pPr>
@@ -3958,7 +4021,7 @@
         <w:pStyle w:val="berschrift2"/>
       </w:pPr>
       <w:bookmarkStart w:id="10" w:name="_Ref76075096"/>
-      <w:bookmarkStart w:id="11" w:name="_Toc146719136"/>
+      <w:bookmarkStart w:id="11" w:name="_Toc228104601"/>
       <w:r>
         <w:t>Certificates</w:t>
       </w:r>
@@ -4111,14 +4174,29 @@
         </w:numPr>
       </w:pPr>
       <w:r>
-        <w:t>The keystore format can be either JKS (Java Key Store) or PKCS12 (PKCS #12)</w:t>
+        <w:t xml:space="preserve">The keystore format can be either </w:t>
+      </w:r>
+      <w:r>
+        <w:t xml:space="preserve">PKCS12 (PKCS #12) or </w:t>
+      </w:r>
+      <w:r>
+        <w:t>JKS (Java Key Store</w:t>
+      </w:r>
+      <w:r>
+        <w:t>; deprecated</w:t>
+      </w:r>
+      <w:r>
+        <w:t>)</w:t>
+      </w:r>
+      <w:r>
+        <w:t>.</w:t>
       </w:r>
     </w:p>
     <w:p>
       <w:pPr>
         <w:pStyle w:val="berschrift2"/>
       </w:pPr>
-      <w:bookmarkStart w:id="12" w:name="_Toc146719137"/>
+      <w:bookmarkStart w:id="12" w:name="_Toc228104602"/>
       <w:r>
         <w:t>Monitoring</w:t>
       </w:r>
@@ -4144,7 +4222,7 @@
       <w:pPr>
         <w:pStyle w:val="berschrift1"/>
       </w:pPr>
-      <w:bookmarkStart w:id="13" w:name="_Toc146719138"/>
+      <w:bookmarkStart w:id="13" w:name="_Toc228104603"/>
       <w:r>
         <w:lastRenderedPageBreak/>
         <w:t>phoss SMP introduction</w:t>
@@ -4184,15 +4262,7 @@
         <w:t>web application that needs to be run in a</w:t>
       </w:r>
       <w:r>
-        <w:t xml:space="preserve"> </w:t>
-      </w:r>
-      <w:proofErr w:type="spellStart"/>
-      <w:r>
-        <w:t>JavaEE</w:t>
-      </w:r>
-      <w:proofErr w:type="spellEnd"/>
-      <w:r>
-        <w:t xml:space="preserve"> application server. It offers a web</w:t>
+        <w:t xml:space="preserve"> JavaEE application server. It offers a web</w:t>
       </w:r>
       <w:r>
         <w:t>-</w:t>
@@ -4204,17 +4274,32 @@
         <w:t xml:space="preserve"> The current version, at the time of writing of this document, is </w:t>
       </w:r>
       <w:r>
-        <w:t>v7.0</w:t>
-      </w:r>
-      <w:r>
-        <w:t>.2.</w:t>
+        <w:t>v</w:t>
+      </w:r>
+      <w:r>
+        <w:t>8</w:t>
+      </w:r>
+      <w:r>
+        <w:t>.</w:t>
+      </w:r>
+      <w:r>
+        <w:t>1</w:t>
+      </w:r>
+      <w:r>
+        <w:t>.</w:t>
+      </w:r>
+      <w:r>
+        <w:t>4</w:t>
+      </w:r>
+      <w:r>
+        <w:t>.</w:t>
       </w:r>
     </w:p>
     <w:p>
       <w:pPr>
         <w:pStyle w:val="berschrift2"/>
       </w:pPr>
-      <w:bookmarkStart w:id="14" w:name="_Toc146719139"/>
+      <w:bookmarkStart w:id="14" w:name="_Toc228104604"/>
       <w:r>
         <w:t xml:space="preserve">Existing </w:t>
       </w:r>
@@ -4240,10 +4325,10 @@
         <w:t>Peppol</w:t>
       </w:r>
       <w:r>
-        <w:t xml:space="preserve"> project and not compatible with other projects like TOOP</w:t>
-      </w:r>
-      <w:r>
-        <w:t xml:space="preserve"> or DE4A</w:t>
+        <w:t xml:space="preserve"> project and not compatible with other projects like </w:t>
+      </w:r>
+      <w:r>
+        <w:t>DBNAlliance</w:t>
       </w:r>
       <w:r>
         <w:t>.</w:t>
@@ -4254,7 +4339,7 @@
         <w:pStyle w:val="berschrift2"/>
       </w:pPr>
       <w:bookmarkStart w:id="15" w:name="_Ref76074707"/>
-      <w:bookmarkStart w:id="16" w:name="_Toc146719140"/>
+      <w:bookmarkStart w:id="16" w:name="_Toc228104605"/>
       <w:r>
         <w:t>Version</w:t>
       </w:r>
@@ -4293,7 +4378,19 @@
         </w:numPr>
       </w:pPr>
       <w:r>
-        <w:t>A relational database system (MySQL or PostgreSQL)</w:t>
+        <w:t>A relational database system (MySQL</w:t>
+      </w:r>
+      <w:r>
+        <w:t>,</w:t>
+      </w:r>
+      <w:r>
+        <w:t xml:space="preserve"> PostgreSQL</w:t>
+      </w:r>
+      <w:r>
+        <w:t>, Oracle, DB2 or MS SQL Server</w:t>
+      </w:r>
+      <w:r>
+        <w:t>)</w:t>
       </w:r>
     </w:p>
     <w:p>
@@ -4327,25 +4424,21 @@
       <w:r>
         <w:t xml:space="preserve">, </w:t>
       </w:r>
-      <w:proofErr w:type="spellStart"/>
       <w:r>
         <w:rPr>
           <w:rStyle w:val="Codeinline"/>
         </w:rPr>
         <w:t>sql</w:t>
       </w:r>
-      <w:proofErr w:type="spellEnd"/>
       <w:r>
         <w:t xml:space="preserve"> and </w:t>
       </w:r>
-      <w:proofErr w:type="spellStart"/>
       <w:r>
         <w:rPr>
           <w:rStyle w:val="Codeinline"/>
         </w:rPr>
         <w:t>mongodb</w:t>
       </w:r>
-      <w:proofErr w:type="spellEnd"/>
       <w:r>
         <w:t>).</w:t>
       </w:r>
@@ -4364,7 +4457,13 @@
         <w:t>ation is</w:t>
       </w:r>
       <w:r>
-        <w:t xml:space="preserve"> to use the “XML” backend, since it </w:t>
+        <w:t xml:space="preserve"> to </w:t>
+      </w:r>
+      <w:r>
+        <w:t>start with</w:t>
+      </w:r>
+      <w:r>
+        <w:t xml:space="preserve"> the “XML” backend, since it </w:t>
       </w:r>
       <w:r>
         <w:t xml:space="preserve">is the easiest to setup. Since the amount of data will </w:t>
@@ -4375,6 +4474,9 @@
       <w:r>
         <w:t>be quite small, there is (in the author’s opinion) no need for a fully-fledged database system.</w:t>
       </w:r>
+      <w:r>
+        <w:t xml:space="preserve"> However, when dealing with more than 10 000 participants, the usage of an SQL or MongoDB backend is recommended.</w:t>
+      </w:r>
     </w:p>
     <w:p>
       <w:r>
@@ -4385,7 +4487,7 @@
       <w:pPr>
         <w:pStyle w:val="berschrift2"/>
       </w:pPr>
-      <w:bookmarkStart w:id="17" w:name="_Toc146719141"/>
+      <w:bookmarkStart w:id="17" w:name="_Toc228104606"/>
       <w:r>
         <w:t>Installation variants</w:t>
       </w:r>
@@ -4408,15 +4510,7 @@
         <w:t xml:space="preserve">Run it directly in an </w:t>
       </w:r>
       <w:r>
-        <w:t xml:space="preserve">existing </w:t>
-      </w:r>
-      <w:proofErr w:type="spellStart"/>
-      <w:r>
-        <w:t>JavaEE</w:t>
-      </w:r>
-      <w:proofErr w:type="spellEnd"/>
-      <w:r>
-        <w:t xml:space="preserve"> </w:t>
+        <w:t xml:space="preserve">existing JavaEE </w:t>
       </w:r>
       <w:r>
         <w:t>application server (like Tomcat or Jetty)</w:t>
@@ -4445,7 +4539,7 @@
         <w:rPr>
           <w:rStyle w:val="Codeinline"/>
         </w:rPr>
-        <w:t>7</w:t>
+        <w:t>8</w:t>
       </w:r>
       <w:r>
         <w:rPr>
@@ -4457,7 +4551,7 @@
         <w:rPr>
           <w:rStyle w:val="Codeinline"/>
         </w:rPr>
-        <w:t>0</w:t>
+        <w:t>1</w:t>
       </w:r>
       <w:r>
         <w:rPr>
@@ -4469,7 +4563,7 @@
         <w:rPr>
           <w:rStyle w:val="Codeinline"/>
         </w:rPr>
-        <w:t>3</w:t>
+        <w:t>4</w:t>
       </w:r>
       <w:r>
         <w:rPr>
@@ -4509,82 +4603,53 @@
       <w:r>
         <w:t xml:space="preserve"> (use </w:t>
       </w:r>
-      <w:proofErr w:type="spellStart"/>
       <w:r>
         <w:rPr>
           <w:rStyle w:val="Codeinline"/>
         </w:rPr>
-        <w:t>phelger</w:t>
-      </w:r>
-      <w:proofErr w:type="spellEnd"/>
+        <w:t>phelger/phoss-smp-xml:latest</w:t>
+      </w:r>
+      <w:r>
+        <w:t xml:space="preserve"> </w:t>
+      </w:r>
+      <w:r>
+        <w:t xml:space="preserve">(for AMD64) or </w:t>
+      </w:r>
       <w:r>
         <w:rPr>
           <w:rStyle w:val="Codeinline"/>
         </w:rPr>
-        <w:t>/</w:t>
-      </w:r>
-      <w:proofErr w:type="spellStart"/>
+        <w:t>phelger/phoss-smp-xml-arm64:latest</w:t>
+      </w:r>
+      <w:r>
+        <w:t xml:space="preserve"> (for ARM64) </w:t>
+      </w:r>
+      <w:r>
+        <w:t>for the XML backend)</w:t>
+      </w:r>
+    </w:p>
+    <w:p>
+      <w:r>
+        <w:t>Independent of the deployment option, the SMP needs a writable directory where it stores all its data. When using a Ja</w:t>
+      </w:r>
+      <w:r>
+        <w:t>karta</w:t>
+      </w:r>
+      <w:r>
+        <w:t>EE application, the directory should be outside the Ja</w:t>
+      </w:r>
+      <w:r>
+        <w:t>karta</w:t>
+      </w:r>
+      <w:r>
+        <w:t xml:space="preserve">EE server directory (e.g. using </w:t>
+      </w:r>
       <w:r>
         <w:rPr>
           <w:rStyle w:val="Codeinline"/>
         </w:rPr>
-        <w:t>phoss-smp-</w:t>
-      </w:r>
-      <w:proofErr w:type="gramStart"/>
-      <w:r>
-        <w:rPr>
-          <w:rStyle w:val="Codeinline"/>
-        </w:rPr>
-        <w:t>xml:latest</w:t>
-      </w:r>
-      <w:proofErr w:type="spellEnd"/>
-      <w:proofErr w:type="gramEnd"/>
-      <w:r>
-        <w:t xml:space="preserve"> for the XML backend)</w:t>
-      </w:r>
-    </w:p>
-    <w:p>
-      <w:r>
-        <w:t xml:space="preserve">Independent of the deployment option, the SMP needs a writable directory where it stores all its data. When using a </w:t>
-      </w:r>
-      <w:proofErr w:type="spellStart"/>
-      <w:r>
-        <w:t>JavaEE</w:t>
-      </w:r>
-      <w:proofErr w:type="spellEnd"/>
-      <w:r>
-        <w:t xml:space="preserve"> application, the directory should be outside the </w:t>
-      </w:r>
-      <w:proofErr w:type="spellStart"/>
-      <w:r>
-        <w:t>JavaEE</w:t>
-      </w:r>
-      <w:proofErr w:type="spellEnd"/>
-      <w:r>
-        <w:t xml:space="preserve"> server directory (</w:t>
-      </w:r>
-      <w:proofErr w:type="gramStart"/>
-      <w:r>
-        <w:t>e.g.</w:t>
-      </w:r>
-      <w:proofErr w:type="gramEnd"/>
-      <w:r>
-        <w:t xml:space="preserve"> using </w:t>
-      </w:r>
-      <w:r>
-        <w:rPr>
-          <w:rStyle w:val="Codeinline"/>
-        </w:rPr>
-        <w:t>/var/</w:t>
-      </w:r>
-      <w:proofErr w:type="spellStart"/>
-      <w:r>
-        <w:rPr>
-          <w:rStyle w:val="Codeinline"/>
-        </w:rPr>
-        <w:t>smp</w:t>
-      </w:r>
-      <w:proofErr w:type="spellEnd"/>
+        <w:t>/var/smp</w:t>
+      </w:r>
       <w:r>
         <w:t xml:space="preserve"> would be an option). When running as a Docker image, please make sure that the volume is mounted from the host system</w:t>
       </w:r>
@@ -4613,6 +4678,7 @@
     </w:p>
     <w:p>
       <w:r>
+        <w:lastRenderedPageBreak/>
         <w:t xml:space="preserve">Additional documentation on how a system can be hardened can be found at </w:t>
       </w:r>
       <w:hyperlink r:id="rId23" w:history="1">
@@ -4632,9 +4698,8 @@
         <w:pStyle w:val="berschrift3"/>
       </w:pPr>
       <w:bookmarkStart w:id="18" w:name="_Ref76628295"/>
-      <w:bookmarkStart w:id="19" w:name="_Toc146719142"/>
-      <w:r>
-        <w:lastRenderedPageBreak/>
+      <w:bookmarkStart w:id="19" w:name="_Toc228104607"/>
+      <w:r>
         <w:t>Path selection</w:t>
       </w:r>
       <w:bookmarkEnd w:id="18"/>
@@ -4642,73 +4707,44 @@
     </w:p>
     <w:p>
       <w:r>
-        <w:t xml:space="preserve">It is highly recommended, to install the SMP as the </w:t>
+        <w:t>There are no specific requirements on the path in which an SMP is deployed</w:t>
+      </w:r>
+      <w:r>
+        <w:t>.</w:t>
+      </w:r>
+    </w:p>
+    <w:p>
+      <w:r>
+        <w:t xml:space="preserve">If you choose to not use the root path, make sure that the configuration item </w:t>
       </w:r>
       <w:r>
         <w:rPr>
           <w:rStyle w:val="Codeinline"/>
         </w:rPr>
-        <w:t>ROOT</w:t>
-      </w:r>
-      <w:r>
-        <w:rPr>
-          <w:rStyle w:val="Funotenzeichen"/>
-          <w:rFonts w:ascii="Courier New" w:hAnsi="Courier New"/>
-          <w:shd w:val="clear" w:color="auto" w:fill="D9D9D9" w:themeFill="background1" w:themeFillShade="D9"/>
-        </w:rPr>
-        <w:footnoteReference w:id="1"/>
-      </w:r>
-      <w:r>
-        <w:t xml:space="preserve"> application, so that it is accessible via the path </w:t>
+        <w:t>smp.forceroot</w:t>
+      </w:r>
+      <w:r>
+        <w:t xml:space="preserve"> in file </w:t>
       </w:r>
       <w:r>
         <w:rPr>
           <w:rStyle w:val="Codeinline"/>
         </w:rPr>
-        <w:t>/</w:t>
-      </w:r>
-      <w:r>
-        <w:t xml:space="preserve"> on the server.</w:t>
-      </w:r>
-    </w:p>
-    <w:p>
-      <w:r>
-        <w:t xml:space="preserve">If you choose to not use the root path, make sure that the configuration item </w:t>
-      </w:r>
-      <w:proofErr w:type="spellStart"/>
-      <w:proofErr w:type="gramStart"/>
+        <w:t>application</w:t>
+      </w:r>
       <w:r>
         <w:rPr>
           <w:rStyle w:val="Codeinline"/>
         </w:rPr>
-        <w:t>smp.forceroot</w:t>
-      </w:r>
-      <w:proofErr w:type="spellEnd"/>
-      <w:proofErr w:type="gramEnd"/>
-      <w:r>
-        <w:t xml:space="preserve"> in file </w:t>
-      </w:r>
-      <w:proofErr w:type="spellStart"/>
+        <w:t>.properties</w:t>
+      </w:r>
+      <w:r>
+        <w:t xml:space="preserve"> to the value </w:t>
+      </w:r>
       <w:r>
         <w:rPr>
           <w:rStyle w:val="Codeinline"/>
         </w:rPr>
-        <w:t>application</w:t>
-      </w:r>
-      <w:r>
-        <w:rPr>
-          <w:rStyle w:val="Codeinline"/>
-        </w:rPr>
-        <w:t>.properties</w:t>
-      </w:r>
-      <w:proofErr w:type="spellEnd"/>
-      <w:r>
-        <w:t xml:space="preserve"> to the value </w:t>
-      </w:r>
-      <w:r>
-        <w:rPr>
-          <w:rStyle w:val="Codeinline"/>
-        </w:rPr>
         <w:t>true</w:t>
       </w:r>
       <w:r>
@@ -4728,7 +4764,7 @@
       <w:pPr>
         <w:pStyle w:val="berschrift3"/>
       </w:pPr>
-      <w:bookmarkStart w:id="20" w:name="_Toc146719143"/>
+      <w:bookmarkStart w:id="20" w:name="_Toc228104608"/>
       <w:r>
         <w:t>Integrating with a reverse proxy</w:t>
       </w:r>
@@ -4739,16 +4775,7 @@
         <w:t xml:space="preserve">phoss SMP </w:t>
       </w:r>
       <w:r>
-        <w:t>MUST NOT</w:t>
-      </w:r>
-      <w:r>
-        <w:rPr>
-          <w:rStyle w:val="Funotenzeichen"/>
-        </w:rPr>
-        <w:footnoteReference w:id="2"/>
-      </w:r>
-      <w:r>
-        <w:t xml:space="preserve"> use </w:t>
+        <w:t xml:space="preserve">MUST use </w:t>
       </w:r>
       <w:r>
         <w:t>https</w:t>
@@ -4775,7 +4802,7 @@
       <w:pPr>
         <w:pStyle w:val="berschrift3"/>
       </w:pPr>
-      <w:bookmarkStart w:id="21" w:name="_Toc146719144"/>
+      <w:bookmarkStart w:id="21" w:name="_Toc228104609"/>
       <w:r>
         <w:t>Security considerations</w:t>
       </w:r>
@@ -4783,30 +4810,7 @@
     </w:p>
     <w:p>
       <w:r>
-        <w:t>From a security perspective, the recommended scenario is to additionally configure the SMP to run on HTTPS (on any port other than 80), and do the modifying actions</w:t>
-      </w:r>
-      <w:r>
-        <w:t xml:space="preserve"> (PUT, POST, DELETE)</w:t>
-      </w:r>
-      <w:r>
-        <w:t xml:space="preserve"> only via HTTPS. </w:t>
-      </w:r>
-      <w:proofErr w:type="spellStart"/>
-      <w:r>
-        <w:t>BasicAuth</w:t>
-      </w:r>
-      <w:proofErr w:type="spellEnd"/>
-      <w:r>
-        <w:t xml:space="preserve"> </w:t>
-      </w:r>
-      <w:r>
-        <w:t xml:space="preserve">or a Bearer Token </w:t>
-      </w:r>
-      <w:r>
-        <w:t>is required anyway but the data is not readable by third-parties because of the underlying transport security. This is something that is currently technically not available but should be used as a convention when running an SMP with this implementation.</w:t>
-      </w:r>
-      <w:r>
-        <w:t xml:space="preserve"> See </w:t>
+        <w:t xml:space="preserve">See </w:t>
       </w:r>
       <w:hyperlink r:id="rId25" w:history="1">
         <w:r>
@@ -4817,14 +4821,34 @@
         </w:r>
       </w:hyperlink>
       <w:r>
-        <w:t xml:space="preserve"> for further details on security </w:t>
+        <w:t xml:space="preserve"> for </w:t>
+      </w:r>
+      <w:r>
+        <w:t>some generic security configuration recommendations.</w:t>
+      </w:r>
+    </w:p>
+    <w:p>
+      <w:r>
+        <w:t xml:space="preserve">For REST API authentication, Bearer Tokens are recommended over Basic Auth </w:t>
+      </w:r>
+      <w:r>
+        <w:t>T</w:t>
+      </w:r>
+      <w:r>
+        <w:t xml:space="preserve">okens </w:t>
+      </w:r>
+      <w:r>
+        <w:t xml:space="preserve">and </w:t>
+      </w:r>
+      <w:r>
+        <w:t>can be created in the management GUI under "Administration | Security | User Tokens".</w:t>
       </w:r>
     </w:p>
     <w:p>
       <w:pPr>
         <w:pStyle w:val="berschrift3"/>
       </w:pPr>
-      <w:bookmarkStart w:id="22" w:name="_Toc146719145"/>
+      <w:bookmarkStart w:id="22" w:name="_Toc228104610"/>
       <w:r>
         <w:t>Verifying the installation</w:t>
       </w:r>
@@ -4871,10 +4895,10 @@
           <w:noProof/>
         </w:rPr>
         <w:drawing>
-          <wp:inline distT="0" distB="0" distL="0" distR="0" wp14:anchorId="2249BAC1" wp14:editId="018E3B69">
-            <wp:extent cx="5760720" cy="1986280"/>
-            <wp:effectExtent l="19050" t="19050" r="11430" b="13970"/>
-            <wp:docPr id="1" name="Grafik 1"/>
+          <wp:inline distT="0" distB="0" distL="0" distR="0" wp14:anchorId="04721213" wp14:editId="682EDCA2">
+            <wp:extent cx="4490817" cy="2286000"/>
+            <wp:effectExtent l="0" t="0" r="5080" b="0"/>
+            <wp:docPr id="2110468319" name="Grafik 1"/>
             <wp:cNvGraphicFramePr>
               <a:graphicFrameLocks xmlns:a="http://schemas.openxmlformats.org/drawingml/2006/main" noChangeAspect="1"/>
             </wp:cNvGraphicFramePr>
@@ -4882,7 +4906,7 @@
               <a:graphicData uri="http://schemas.openxmlformats.org/drawingml/2006/picture">
                 <pic:pic xmlns:pic="http://schemas.openxmlformats.org/drawingml/2006/picture">
                   <pic:nvPicPr>
-                    <pic:cNvPr id="1" name=""/>
+                    <pic:cNvPr id="2110468319" name=""/>
                     <pic:cNvPicPr/>
                   </pic:nvPicPr>
                   <pic:blipFill>
@@ -4894,18 +4918,11 @@
                   <pic:spPr>
                     <a:xfrm>
                       <a:off x="0" y="0"/>
-                      <a:ext cx="5760720" cy="1986280"/>
+                      <a:ext cx="4511547" cy="2296553"/>
                     </a:xfrm>
                     <a:prstGeom prst="rect">
                       <a:avLst/>
                     </a:prstGeom>
-                    <a:ln>
-                      <a:solidFill>
-                        <a:schemeClr val="bg1">
-                          <a:lumMod val="85000"/>
-                        </a:schemeClr>
-                      </a:solidFill>
-                    </a:ln>
                   </pic:spPr>
                 </pic:pic>
               </a:graphicData>
@@ -4965,10 +4982,10 @@
         </w:rPr>
         <w:lastRenderedPageBreak/>
         <w:drawing>
-          <wp:inline distT="0" distB="0" distL="0" distR="0" wp14:anchorId="4889CE96" wp14:editId="69C7271C">
-            <wp:extent cx="4476585" cy="1591872"/>
-            <wp:effectExtent l="19050" t="19050" r="19685" b="27940"/>
-            <wp:docPr id="3" name="Grafik 3"/>
+          <wp:inline distT="0" distB="0" distL="0" distR="0" wp14:anchorId="59F82B12" wp14:editId="299BF40E">
+            <wp:extent cx="4093784" cy="1772529"/>
+            <wp:effectExtent l="0" t="0" r="0" b="5715"/>
+            <wp:docPr id="646181900" name="Grafik 1"/>
             <wp:cNvGraphicFramePr>
               <a:graphicFrameLocks xmlns:a="http://schemas.openxmlformats.org/drawingml/2006/main" noChangeAspect="1"/>
             </wp:cNvGraphicFramePr>
@@ -4976,7 +4993,7 @@
               <a:graphicData uri="http://schemas.openxmlformats.org/drawingml/2006/picture">
                 <pic:pic xmlns:pic="http://schemas.openxmlformats.org/drawingml/2006/picture">
                   <pic:nvPicPr>
-                    <pic:cNvPr id="1" name=""/>
+                    <pic:cNvPr id="646181900" name=""/>
                     <pic:cNvPicPr/>
                   </pic:nvPicPr>
                   <pic:blipFill>
@@ -4988,18 +5005,11 @@
                   <pic:spPr>
                     <a:xfrm>
                       <a:off x="0" y="0"/>
-                      <a:ext cx="4482197" cy="1593868"/>
+                      <a:ext cx="4155544" cy="1799270"/>
                     </a:xfrm>
                     <a:prstGeom prst="rect">
                       <a:avLst/>
                     </a:prstGeom>
-                    <a:ln>
-                      <a:solidFill>
-                        <a:schemeClr val="bg1">
-                          <a:lumMod val="85000"/>
-                        </a:schemeClr>
-                      </a:solidFill>
-                    </a:ln>
                   </pic:spPr>
                 </pic:pic>
               </a:graphicData>
@@ -5032,14 +5042,12 @@
       <w:r>
         <w:t xml:space="preserve">For error handling, please see the application server log files. For Tomcat these are usually </w:t>
       </w:r>
-      <w:proofErr w:type="spellStart"/>
       <w:r>
         <w:rPr>
           <w:rStyle w:val="Codeinline"/>
         </w:rPr>
         <w:t>catalina.out</w:t>
       </w:r>
-      <w:proofErr w:type="spellEnd"/>
       <w:r>
         <w:t xml:space="preserve"> and </w:t>
       </w:r>
@@ -5068,35 +5076,13 @@
         <w:t xml:space="preserve"> error </w:t>
       </w:r>
       <w:r>
-        <w:t>is not contained, stepping into the running image (</w:t>
-      </w:r>
-      <w:proofErr w:type="gramStart"/>
-      <w:r>
-        <w:t>e.g.</w:t>
-      </w:r>
-      <w:proofErr w:type="gramEnd"/>
-      <w:r>
-        <w:t xml:space="preserve"> via </w:t>
+        <w:t xml:space="preserve">is not contained, stepping into the running image (e.g. via </w:t>
       </w:r>
       <w:r>
         <w:rPr>
           <w:rStyle w:val="Codeinline"/>
         </w:rPr>
-        <w:t>docker exec -it phoss-</w:t>
-      </w:r>
-      <w:proofErr w:type="spellStart"/>
-      <w:r>
-        <w:rPr>
-          <w:rStyle w:val="Codeinline"/>
-        </w:rPr>
-        <w:t>smp</w:t>
-      </w:r>
-      <w:proofErr w:type="spellEnd"/>
-      <w:r>
-        <w:rPr>
-          <w:rStyle w:val="Codeinline"/>
-        </w:rPr>
-        <w:t xml:space="preserve"> bash</w:t>
+        <w:t>docker exec -it phoss-smp bash</w:t>
       </w:r>
       <w:r>
         <w:t>) and then finding the Tomcat log files may be inevitable.</w:t>
@@ -5106,7 +5092,7 @@
       <w:pPr>
         <w:pStyle w:val="berschrift2"/>
       </w:pPr>
-      <w:bookmarkStart w:id="23" w:name="_Toc146719146"/>
+      <w:bookmarkStart w:id="23" w:name="_Toc228104611"/>
       <w:r>
         <w:t xml:space="preserve">SMP </w:t>
       </w:r>
@@ -5133,10 +5119,13 @@
     </w:p>
     <w:p>
       <w:r>
-        <w:t xml:space="preserve">You need to have the SMP JKS </w:t>
-      </w:r>
-      <w:r>
-        <w:t xml:space="preserve">or PKCS12 </w:t>
+        <w:t xml:space="preserve">You need to have the SMP </w:t>
+      </w:r>
+      <w:r>
+        <w:t xml:space="preserve">PKCS12 </w:t>
+      </w:r>
+      <w:r>
+        <w:t xml:space="preserve">(or JKS) </w:t>
       </w:r>
       <w:r>
         <w:t xml:space="preserve">key store (see chapter </w:t>
@@ -5176,16 +5165,12 @@
       <w:r>
         <w:t xml:space="preserve"> </w:t>
       </w:r>
-      <w:proofErr w:type="spellStart"/>
-      <w:proofErr w:type="gramStart"/>
       <w:r>
         <w:rPr>
           <w:rStyle w:val="Codeinline"/>
         </w:rPr>
         <w:t>application.properties</w:t>
       </w:r>
-      <w:proofErr w:type="spellEnd"/>
-      <w:proofErr w:type="gramEnd"/>
       <w:r>
         <w:t xml:space="preserve"> a</w:t>
       </w:r>
@@ -5221,16 +5206,12 @@
           <w:shd w:val="clear" w:color="auto" w:fill="auto"/>
         </w:rPr>
       </w:pPr>
-      <w:proofErr w:type="spellStart"/>
-      <w:proofErr w:type="gramStart"/>
       <w:r>
         <w:rPr>
           <w:rStyle w:val="Codeinline"/>
         </w:rPr>
         <w:t>global.debug</w:t>
       </w:r>
-      <w:proofErr w:type="spellEnd"/>
-      <w:proofErr w:type="gramEnd"/>
       <w:r>
         <w:rPr>
           <w:rStyle w:val="Codeinline"/>
@@ -5259,16 +5240,12 @@
           <w:shd w:val="clear" w:color="auto" w:fill="auto"/>
         </w:rPr>
       </w:pPr>
-      <w:proofErr w:type="spellStart"/>
-      <w:proofErr w:type="gramStart"/>
       <w:r>
         <w:rPr>
           <w:rStyle w:val="Codeinline"/>
         </w:rPr>
         <w:t>global.production</w:t>
       </w:r>
-      <w:proofErr w:type="spellEnd"/>
-      <w:proofErr w:type="gramEnd"/>
       <w:r>
         <w:rPr>
           <w:rStyle w:val="Codeinline"/>
@@ -5297,16 +5274,12 @@
           <w:shd w:val="clear" w:color="auto" w:fill="auto"/>
         </w:rPr>
       </w:pPr>
-      <w:proofErr w:type="spellStart"/>
-      <w:proofErr w:type="gramStart"/>
       <w:r>
         <w:rPr>
           <w:rStyle w:val="Codeinline"/>
         </w:rPr>
         <w:t>global.debugjaxws</w:t>
       </w:r>
-      <w:proofErr w:type="spellEnd"/>
-      <w:proofErr w:type="gramEnd"/>
       <w:r>
         <w:rPr>
           <w:rStyle w:val="Codeinline"/>
@@ -5330,16 +5303,12 @@
           <w:numId w:val="7"/>
         </w:numPr>
       </w:pPr>
-      <w:proofErr w:type="spellStart"/>
-      <w:proofErr w:type="gramStart"/>
       <w:r>
         <w:rPr>
           <w:rStyle w:val="Codeinline"/>
         </w:rPr>
         <w:t>webapp.datapath</w:t>
       </w:r>
-      <w:proofErr w:type="spellEnd"/>
-      <w:proofErr w:type="gramEnd"/>
       <w:r>
         <w:t xml:space="preserve"> MUST be set to the absolute directory, where all data will be stored.</w:t>
       </w:r>
@@ -5352,16 +5321,12 @@
           <w:numId w:val="7"/>
         </w:numPr>
       </w:pPr>
-      <w:proofErr w:type="spellStart"/>
-      <w:proofErr w:type="gramStart"/>
       <w:r>
         <w:rPr>
           <w:rStyle w:val="Codeinline"/>
         </w:rPr>
         <w:t>smp.backend</w:t>
       </w:r>
-      <w:proofErr w:type="spellEnd"/>
-      <w:proofErr w:type="gramEnd"/>
       <w:r>
         <w:t xml:space="preserve"> MUST be set to </w:t>
       </w:r>
@@ -5380,24 +5345,26 @@
           <w:numId w:val="7"/>
         </w:numPr>
       </w:pPr>
-      <w:proofErr w:type="spellStart"/>
-      <w:proofErr w:type="gramStart"/>
       <w:r>
         <w:rPr>
           <w:rStyle w:val="Codeinline"/>
         </w:rPr>
-        <w:t>smp.keystore</w:t>
-      </w:r>
-      <w:proofErr w:type="gramEnd"/>
+        <w:t>smp.keystore.type</w:t>
+      </w:r>
+      <w:r>
+        <w:t xml:space="preserve"> MUST be set to </w:t>
+      </w:r>
       <w:r>
         <w:rPr>
           <w:rStyle w:val="Codeinline"/>
         </w:rPr>
-        <w:t>.type</w:t>
-      </w:r>
-      <w:proofErr w:type="spellEnd"/>
-      <w:r>
-        <w:t xml:space="preserve"> MUST be set to </w:t>
+        <w:t>PKCS12</w:t>
+      </w:r>
+      <w:r>
+        <w:t xml:space="preserve"> </w:t>
+      </w:r>
+      <w:r>
+        <w:t xml:space="preserve">or </w:t>
       </w:r>
       <w:r>
         <w:rPr>
@@ -5409,16 +5376,7 @@
         <w:t xml:space="preserve"> </w:t>
       </w:r>
       <w:r>
-        <w:t xml:space="preserve">or </w:t>
-      </w:r>
-      <w:r>
-        <w:rPr>
-          <w:rStyle w:val="Codeinline"/>
-        </w:rPr>
-        <w:t>PKCS12</w:t>
-      </w:r>
-      <w:r>
-        <w:t xml:space="preserve"> dep</w:t>
+        <w:t>dep</w:t>
       </w:r>
       <w:r>
         <w:t>ending on your key</w:t>
@@ -5435,22 +5393,12 @@
           <w:numId w:val="7"/>
         </w:numPr>
       </w:pPr>
-      <w:proofErr w:type="spellStart"/>
-      <w:proofErr w:type="gramStart"/>
       <w:r>
         <w:rPr>
           <w:rStyle w:val="Codeinline"/>
         </w:rPr>
-        <w:t>smp.keystore</w:t>
-      </w:r>
-      <w:proofErr w:type="gramEnd"/>
-      <w:r>
-        <w:rPr>
-          <w:rStyle w:val="Codeinline"/>
-        </w:rPr>
-        <w:t>.path</w:t>
-      </w:r>
-      <w:proofErr w:type="spellEnd"/>
+        <w:t>smp.keystore.path</w:t>
+      </w:r>
       <w:r>
         <w:t xml:space="preserve"> MUST be set to the absolute path where the SMP certificate resides on your server</w:t>
       </w:r>
@@ -5463,22 +5411,12 @@
           <w:numId w:val="7"/>
         </w:numPr>
       </w:pPr>
-      <w:proofErr w:type="spellStart"/>
-      <w:proofErr w:type="gramStart"/>
       <w:r>
         <w:rPr>
           <w:rStyle w:val="Codeinline"/>
         </w:rPr>
-        <w:t>smp.keystore</w:t>
-      </w:r>
-      <w:proofErr w:type="gramEnd"/>
-      <w:r>
-        <w:rPr>
-          <w:rStyle w:val="Codeinline"/>
-        </w:rPr>
-        <w:t>.password</w:t>
-      </w:r>
-      <w:proofErr w:type="spellEnd"/>
+        <w:t>smp.keystore.password</w:t>
+      </w:r>
       <w:r>
         <w:t xml:space="preserve"> MUST be set to the plaintext password of the keystore. Mind trailing spaces!</w:t>
       </w:r>
@@ -5491,16 +5429,12 @@
           <w:numId w:val="7"/>
         </w:numPr>
       </w:pPr>
-      <w:proofErr w:type="spellStart"/>
-      <w:proofErr w:type="gramStart"/>
       <w:r>
         <w:rPr>
           <w:rStyle w:val="Codeinline"/>
         </w:rPr>
         <w:t>smp.keystore.key.alias</w:t>
       </w:r>
-      <w:proofErr w:type="spellEnd"/>
-      <w:proofErr w:type="gramEnd"/>
       <w:r>
         <w:t xml:space="preserve"> MUST be set to the name of the entry/alias in the keystore.</w:t>
       </w:r>
@@ -5513,16 +5447,12 @@
           <w:numId w:val="7"/>
         </w:numPr>
       </w:pPr>
-      <w:proofErr w:type="spellStart"/>
-      <w:proofErr w:type="gramStart"/>
       <w:r>
         <w:rPr>
           <w:rStyle w:val="Codeinline"/>
         </w:rPr>
         <w:t>smp.keystore.key.password</w:t>
       </w:r>
-      <w:proofErr w:type="spellEnd"/>
-      <w:proofErr w:type="gramEnd"/>
       <w:r>
         <w:t xml:space="preserve"> MUST be set to the plaintext password of the key. Usually this is the same as for the full keystore. Mind trailing spaces!</w:t>
       </w:r>
@@ -5535,51 +5465,14 @@
           <w:numId w:val="7"/>
         </w:numPr>
       </w:pPr>
-      <w:proofErr w:type="spellStart"/>
-      <w:proofErr w:type="gramStart"/>
       <w:r>
         <w:rPr>
           <w:rStyle w:val="Codeinline"/>
         </w:rPr>
-        <w:t>sml.smpid</w:t>
-      </w:r>
-      <w:proofErr w:type="spellEnd"/>
-      <w:proofErr w:type="gramEnd"/>
-      <w:r>
-        <w:t xml:space="preserve"> SHOULD be set to </w:t>
-      </w:r>
-      <w:r>
-        <w:rPr>
-          <w:rStyle w:val="Codeinline"/>
-        </w:rPr>
-        <w:t>SMP-XX</w:t>
-      </w:r>
-      <w:r>
-        <w:t xml:space="preserve"> where </w:t>
-      </w:r>
-      <w:r>
-        <w:rPr>
-          <w:rStyle w:val="Codeinline"/>
-        </w:rPr>
-        <w:t>XX</w:t>
-      </w:r>
-      <w:r>
-        <w:t xml:space="preserve"> denotes </w:t>
-      </w:r>
-      <w:r>
-        <w:t>your company details, in all uppercase chars</w:t>
-      </w:r>
-      <w:r>
-        <w:t>.</w:t>
-      </w:r>
-      <w:r>
-        <w:t xml:space="preserve"> This ID MUST be unique within the whole </w:t>
-      </w:r>
-      <w:r>
-        <w:t>Peppol</w:t>
-      </w:r>
-      <w:r>
-        <w:t xml:space="preserve"> network.</w:t>
+        <w:t>smp.truststore.type</w:t>
+      </w:r>
+      <w:r>
+        <w:t xml:space="preserve"> MUST be set to PKCS12 (or JKS) depending on the truststore format</w:t>
       </w:r>
     </w:p>
     <w:p>
@@ -5590,30 +5483,33 @@
           <w:numId w:val="7"/>
         </w:numPr>
       </w:pPr>
-      <w:proofErr w:type="spellStart"/>
-      <w:proofErr w:type="gramStart"/>
       <w:r>
         <w:rPr>
           <w:rStyle w:val="Codeinline"/>
         </w:rPr>
-        <w:t>smp.publicurl</w:t>
-      </w:r>
-      <w:proofErr w:type="spellEnd"/>
-      <w:proofErr w:type="gramEnd"/>
-      <w:r>
-        <w:t xml:space="preserve"> MUST be set to the public URL of your SMP server (including an eventual application path</w:t>
-      </w:r>
-      <w:r>
-        <w:t xml:space="preserve"> – e.g. </w:t>
+        <w:t>smp.truststore.path</w:t>
+      </w:r>
+      <w:r>
+        <w:t xml:space="preserve"> MUST be set to the path of the Peppol truststore. If bundled truststores from peppol-commons are used, a relative classpath-based path like </w:t>
       </w:r>
       <w:r>
         <w:rPr>
           <w:rStyle w:val="Codeinline"/>
         </w:rPr>
-        <w:t>https://smp.example.org/smp</w:t>
-      </w:r>
-      <w:r>
-        <w:t>)</w:t>
+        <w:lastRenderedPageBreak/>
+        <w:t>truststore/2025/smp-test-truststore.p12</w:t>
+      </w:r>
+      <w:r>
+        <w:t xml:space="preserve"> (pilot) or </w:t>
+      </w:r>
+      <w:r>
+        <w:rPr>
+          <w:rStyle w:val="Codeinline"/>
+        </w:rPr>
+        <w:t>truststore/2025/smp-prod-truststore.p12</w:t>
+      </w:r>
+      <w:r>
+        <w:t xml:space="preserve"> (production) is sufficient.</w:t>
       </w:r>
     </w:p>
     <w:p>
@@ -5624,27 +5520,24 @@
           <w:numId w:val="7"/>
         </w:numPr>
       </w:pPr>
-      <w:proofErr w:type="spellStart"/>
-      <w:proofErr w:type="gramStart"/>
       <w:r>
         <w:rPr>
           <w:rStyle w:val="Codeinline"/>
         </w:rPr>
-        <w:t>smp.identifiertype</w:t>
-      </w:r>
-      <w:proofErr w:type="spellEnd"/>
-      <w:proofErr w:type="gramEnd"/>
-      <w:r>
-        <w:t xml:space="preserve"> MUST be set to </w:t>
-      </w:r>
-      <w:proofErr w:type="spellStart"/>
+        <w:t>smp.truststore.password</w:t>
+      </w:r>
+      <w:r>
+        <w:t xml:space="preserve"> MUST be set to the plaintext password of the truststore. The default password for bundled truststores is </w:t>
+      </w:r>
       <w:r>
         <w:rPr>
           <w:rStyle w:val="Codeinline"/>
         </w:rPr>
         <w:t>peppol</w:t>
       </w:r>
-      <w:proofErr w:type="spellEnd"/>
+      <w:r>
+        <w:t>.</w:t>
+      </w:r>
     </w:p>
     <w:p>
       <w:pPr>
@@ -5653,39 +5546,49 @@
           <w:ilvl w:val="0"/>
           <w:numId w:val="7"/>
         </w:numPr>
+      </w:pPr>
+      <w:r>
         <w:rPr>
           <w:rStyle w:val="Codeinline"/>
-          <w:rFonts w:asciiTheme="minorHAnsi" w:hAnsiTheme="minorHAnsi"/>
-          <w:shd w:val="clear" w:color="auto" w:fill="auto"/>
-        </w:rPr>
-      </w:pPr>
-      <w:proofErr w:type="spellStart"/>
-      <w:proofErr w:type="gramStart"/>
+        </w:rPr>
+        <w:t>sml.smpid</w:t>
+      </w:r>
+      <w:r>
+        <w:t xml:space="preserve"> SHOULD be set to </w:t>
+      </w:r>
       <w:r>
         <w:rPr>
           <w:rStyle w:val="Codeinline"/>
         </w:rPr>
-        <w:t>smp.rest</w:t>
-      </w:r>
-      <w:proofErr w:type="gramEnd"/>
+        <w:t>SMP-XX</w:t>
+      </w:r>
+      <w:r>
+        <w:t xml:space="preserve"> where </w:t>
+      </w:r>
       <w:r>
         <w:rPr>
           <w:rStyle w:val="Codeinline"/>
         </w:rPr>
-        <w:t>.type</w:t>
-      </w:r>
-      <w:proofErr w:type="spellEnd"/>
-      <w:r>
-        <w:t xml:space="preserve"> MUST be set to </w:t>
-      </w:r>
-      <w:proofErr w:type="spellStart"/>
-      <w:r>
-        <w:rPr>
-          <w:rStyle w:val="Codeinline"/>
-        </w:rPr>
-        <w:t>peppol</w:t>
-      </w:r>
-      <w:proofErr w:type="spellEnd"/>
+        <w:t>XX</w:t>
+      </w:r>
+      <w:r>
+        <w:t xml:space="preserve"> denotes </w:t>
+      </w:r>
+      <w:r>
+        <w:t>your company details, in all uppercase chars</w:t>
+      </w:r>
+      <w:r>
+        <w:t>.</w:t>
+      </w:r>
+      <w:r>
+        <w:t xml:space="preserve"> This ID MUST be unique within the whole </w:t>
+      </w:r>
+      <w:r>
+        <w:t>Peppol</w:t>
+      </w:r>
+      <w:r>
+        <w:t xml:space="preserve"> network.</w:t>
+      </w:r>
     </w:p>
     <w:p>
       <w:pPr>
@@ -5695,43 +5598,26 @@
           <w:numId w:val="7"/>
         </w:numPr>
       </w:pPr>
-      <w:proofErr w:type="spellStart"/>
-      <w:proofErr w:type="gramStart"/>
       <w:r>
         <w:rPr>
           <w:rStyle w:val="Codeinline"/>
         </w:rPr>
-        <w:lastRenderedPageBreak/>
-        <w:t>keystore.type</w:t>
-      </w:r>
-      <w:proofErr w:type="spellEnd"/>
-      <w:proofErr w:type="gramEnd"/>
-      <w:r>
-        <w:t xml:space="preserve"> MUST be set to </w:t>
+        <w:t>smp.publicurl</w:t>
+      </w:r>
+      <w:r>
+        <w:t xml:space="preserve"> MUST be set to the public URL of your SMP server (including an eventual application path</w:t>
+      </w:r>
+      <w:r>
+        <w:t xml:space="preserve"> – e.g. </w:t>
       </w:r>
       <w:r>
         <w:rPr>
           <w:rStyle w:val="Codeinline"/>
         </w:rPr>
-        <w:t>JKS</w:t>
-      </w:r>
-      <w:r>
-        <w:t xml:space="preserve"> or </w:t>
-      </w:r>
-      <w:r>
-        <w:rPr>
-          <w:rStyle w:val="Codeinline"/>
-        </w:rPr>
-        <w:t>PKCS12</w:t>
-      </w:r>
-      <w:r>
-        <w:t xml:space="preserve"> dep</w:t>
-      </w:r>
-      <w:r>
-        <w:t>ending on your key</w:t>
-      </w:r>
-      <w:r>
-        <w:t>store</w:t>
+        <w:t>https://smp.example.org/smp</w:t>
+      </w:r>
+      <w:r>
+        <w:t>)</w:t>
       </w:r>
     </w:p>
     <w:p>
@@ -5742,18 +5628,20 @@
           <w:numId w:val="7"/>
         </w:numPr>
       </w:pPr>
-      <w:proofErr w:type="spellStart"/>
-      <w:proofErr w:type="gramStart"/>
       <w:r>
         <w:rPr>
           <w:rStyle w:val="Codeinline"/>
         </w:rPr>
-        <w:t>keystore.path</w:t>
-      </w:r>
-      <w:proofErr w:type="spellEnd"/>
-      <w:proofErr w:type="gramEnd"/>
-      <w:r>
-        <w:t xml:space="preserve"> MUST be set to the absolute path where the SMP certificate resides on your server</w:t>
+        <w:t>smp.identifiertype</w:t>
+      </w:r>
+      <w:r>
+        <w:t xml:space="preserve"> MUST be set to </w:t>
+      </w:r>
+      <w:r>
+        <w:rPr>
+          <w:rStyle w:val="Codeinline"/>
+        </w:rPr>
+        <w:t>peppol</w:t>
       </w:r>
     </w:p>
     <w:p>
@@ -5763,63 +5651,26 @@
           <w:ilvl w:val="0"/>
           <w:numId w:val="7"/>
         </w:numPr>
-      </w:pPr>
-      <w:proofErr w:type="spellStart"/>
-      <w:proofErr w:type="gramStart"/>
-      <w:r>
         <w:rPr>
           <w:rStyle w:val="Codeinline"/>
-        </w:rPr>
-        <w:t>keystore.password</w:t>
-      </w:r>
-      <w:proofErr w:type="spellEnd"/>
-      <w:proofErr w:type="gramEnd"/>
-      <w:r>
-        <w:t xml:space="preserve"> MUST be set to the plaintext password of the keystore. Mind trailing spaces!</w:t>
-      </w:r>
-    </w:p>
-    <w:p>
-      <w:pPr>
-        <w:pStyle w:val="Listenabsatz"/>
-        <w:numPr>
-          <w:ilvl w:val="0"/>
-          <w:numId w:val="7"/>
-        </w:numPr>
-      </w:pPr>
-      <w:proofErr w:type="spellStart"/>
-      <w:proofErr w:type="gramStart"/>
+          <w:rFonts w:asciiTheme="minorHAnsi" w:hAnsiTheme="minorHAnsi"/>
+          <w:shd w:val="clear" w:color="auto" w:fill="auto"/>
+        </w:rPr>
+      </w:pPr>
       <w:r>
         <w:rPr>
           <w:rStyle w:val="Codeinline"/>
         </w:rPr>
-        <w:t>keystore.key.alias</w:t>
-      </w:r>
-      <w:proofErr w:type="spellEnd"/>
-      <w:proofErr w:type="gramEnd"/>
-      <w:r>
-        <w:t xml:space="preserve"> MUST be set to the name of the entry/alias in the keystore.</w:t>
-      </w:r>
-    </w:p>
-    <w:p>
-      <w:pPr>
-        <w:pStyle w:val="Listenabsatz"/>
-        <w:numPr>
-          <w:ilvl w:val="0"/>
-          <w:numId w:val="7"/>
-        </w:numPr>
-      </w:pPr>
-      <w:proofErr w:type="spellStart"/>
-      <w:proofErr w:type="gramStart"/>
+        <w:t>smp.rest.type</w:t>
+      </w:r>
+      <w:r>
+        <w:t xml:space="preserve"> MUST be set to </w:t>
+      </w:r>
       <w:r>
         <w:rPr>
           <w:rStyle w:val="Codeinline"/>
         </w:rPr>
-        <w:t>keystore.key.password</w:t>
-      </w:r>
-      <w:proofErr w:type="spellEnd"/>
-      <w:proofErr w:type="gramEnd"/>
-      <w:r>
-        <w:t xml:space="preserve"> MUST be set to the plaintext password of the key. Usually this is the same as for the full keystore. Mind trailing spaces!</w:t>
+        <w:t>peppol</w:t>
       </w:r>
     </w:p>
     <w:p>
@@ -5873,7 +5724,7 @@
       <w:pPr>
         <w:pStyle w:val="berschrift2"/>
       </w:pPr>
-      <w:bookmarkStart w:id="24" w:name="_Toc146719147"/>
+      <w:bookmarkStart w:id="24" w:name="_Toc228104612"/>
       <w:r>
         <w:t>Initial setup</w:t>
       </w:r>
@@ -5923,7 +5774,7 @@
       <w:pPr>
         <w:pStyle w:val="berschrift3"/>
       </w:pPr>
-      <w:bookmarkStart w:id="25" w:name="_Toc146719148"/>
+      <w:bookmarkStart w:id="25" w:name="_Toc228104613"/>
       <w:r>
         <w:t>General user interface elements</w:t>
       </w:r>
@@ -6009,6 +5860,7 @@
     </w:p>
     <w:p>
       <w:r>
+        <w:lastRenderedPageBreak/>
         <w:t>The main layout consists of:</w:t>
       </w:r>
     </w:p>
@@ -6033,7 +5885,6 @@
         </w:numPr>
       </w:pPr>
       <w:r>
-        <w:lastRenderedPageBreak/>
         <w:t>a content area right of the menu (denoted by “2.”), where the main page content is displayed</w:t>
       </w:r>
     </w:p>
@@ -6112,7 +5963,7 @@
       <w:pPr>
         <w:pStyle w:val="berschrift3"/>
       </w:pPr>
-      <w:bookmarkStart w:id="26" w:name="_Toc146719149"/>
+      <w:bookmarkStart w:id="26" w:name="_Toc228104614"/>
       <w:r>
         <w:t xml:space="preserve">Change </w:t>
       </w:r>
@@ -6209,7 +6060,7 @@
       <w:pPr>
         <w:pStyle w:val="berschrift3"/>
       </w:pPr>
-      <w:bookmarkStart w:id="27" w:name="_Toc146719150"/>
+      <w:bookmarkStart w:id="27" w:name="_Toc228104615"/>
       <w:r>
         <w:t>Change default email address (optional)</w:t>
       </w:r>
@@ -6411,7 +6262,7 @@
       <w:pPr>
         <w:pStyle w:val="berschrift3"/>
       </w:pPr>
-      <w:bookmarkStart w:id="28" w:name="_Toc146719151"/>
+      <w:bookmarkStart w:id="28" w:name="_Toc228104616"/>
       <w:r>
         <w:t>Select the SML for usage</w:t>
       </w:r>
@@ -6527,13 +6378,28 @@
         <w:t>For the field “SML configuration:” select the</w:t>
       </w:r>
       <w:r>
-        <w:t xml:space="preserve"> “SMK”</w:t>
-      </w:r>
-      <w:r>
         <w:t xml:space="preserve"> </w:t>
       </w:r>
       <w:r>
+        <w:t xml:space="preserve">“Peppol SML” entry for the Peppol production system or </w:t>
+      </w:r>
+      <w:r>
+        <w:t>“</w:t>
+      </w:r>
+      <w:r>
+        <w:t>Peppol T-SML</w:t>
+      </w:r>
+      <w:r>
+        <w:t>”</w:t>
+      </w:r>
+      <w:r>
+        <w:t xml:space="preserve"> </w:t>
+      </w:r>
+      <w:r>
         <w:t>entry</w:t>
+      </w:r>
+      <w:r>
+        <w:t xml:space="preserve"> for the Peppol test system.</w:t>
       </w:r>
     </w:p>
     <w:p>
@@ -6720,7 +6586,7 @@
       <w:pPr>
         <w:pStyle w:val="berschrift3"/>
       </w:pPr>
-      <w:bookmarkStart w:id="29" w:name="_Toc146719152"/>
+      <w:bookmarkStart w:id="29" w:name="_Toc228104617"/>
       <w:r>
         <w:t>Verify the configuration</w:t>
       </w:r>
@@ -6802,7 +6668,7 @@
       <w:pPr>
         <w:pStyle w:val="berschrift3"/>
       </w:pPr>
-      <w:bookmarkStart w:id="30" w:name="_Toc146719153"/>
+      <w:bookmarkStart w:id="30" w:name="_Toc228104618"/>
       <w:r>
         <w:t>Register the SMP to the SML</w:t>
       </w:r>
@@ -6965,7 +6831,7 @@
       <w:pPr>
         <w:pStyle w:val="berschrift1"/>
       </w:pPr>
-      <w:bookmarkStart w:id="31" w:name="_Toc146719154"/>
+      <w:bookmarkStart w:id="31" w:name="_Toc228104619"/>
       <w:r>
         <w:lastRenderedPageBreak/>
         <w:t>Operating the SMP</w:t>
@@ -6992,7 +6858,7 @@
       <w:pPr>
         <w:pStyle w:val="berschrift2"/>
       </w:pPr>
-      <w:bookmarkStart w:id="32" w:name="_Toc146719155"/>
+      <w:bookmarkStart w:id="32" w:name="_Toc228104620"/>
       <w:r>
         <w:t>Participant / Service Group management</w:t>
       </w:r>
@@ -7297,7 +7163,7 @@
       <w:pPr>
         <w:pStyle w:val="berschrift2"/>
       </w:pPr>
-      <w:bookmarkStart w:id="33" w:name="_Toc146719156"/>
+      <w:bookmarkStart w:id="33" w:name="_Toc228104621"/>
       <w:r>
         <w:t>Endpoint management</w:t>
       </w:r>
@@ -7441,14 +7307,12 @@
       <w:r>
         <w:t xml:space="preserve"> scheme MUST be </w:t>
       </w:r>
-      <w:proofErr w:type="spellStart"/>
       <w:r>
         <w:rPr>
           <w:rStyle w:val="Codeinline"/>
         </w:rPr>
         <w:t>busdox-docid-qns</w:t>
       </w:r>
-      <w:proofErr w:type="spellEnd"/>
       <w:r>
         <w:t xml:space="preserve"> according to </w:t>
       </w:r>
@@ -7539,14 +7403,12 @@
       <w:r>
         <w:t xml:space="preserve"> scheme MUST be </w:t>
       </w:r>
-      <w:proofErr w:type="spellStart"/>
       <w:r>
         <w:rPr>
           <w:rStyle w:val="Codeinline"/>
         </w:rPr>
         <w:t>cenbii-procid-ubl</w:t>
       </w:r>
-      <w:proofErr w:type="spellEnd"/>
     </w:p>
     <w:p>
       <w:pPr>
@@ -7914,12 +7776,18 @@
       <w:r>
         <w:t xml:space="preserve"> for details.</w:t>
       </w:r>
+      <w:r>
+        <w:t xml:space="preserve"> </w:t>
+      </w:r>
+      <w:r>
+        <w:t>Business Cards for the Peppol Directory can also be managed via the REST API.</w:t>
+      </w:r>
     </w:p>
     <w:p>
       <w:pPr>
         <w:pStyle w:val="berschrift2"/>
       </w:pPr>
-      <w:bookmarkStart w:id="34" w:name="_Toc146719157"/>
+      <w:bookmarkStart w:id="34" w:name="_Toc228104622"/>
       <w:r>
         <w:t>Maintenance tasks</w:t>
       </w:r>
@@ -7929,7 +7797,7 @@
       <w:pPr>
         <w:pStyle w:val="berschrift3"/>
       </w:pPr>
-      <w:bookmarkStart w:id="35" w:name="_Toc146719158"/>
+      <w:bookmarkStart w:id="35" w:name="_Toc228104623"/>
       <w:r>
         <w:t>Change an AS4 endpoint URL</w:t>
       </w:r>
@@ -7944,7 +7812,7 @@
       <w:pPr>
         <w:pStyle w:val="berschrift3"/>
       </w:pPr>
-      <w:bookmarkStart w:id="36" w:name="_Toc146719159"/>
+      <w:bookmarkStart w:id="36" w:name="_Toc228104624"/>
       <w:r>
         <w:t>Change</w:t>
       </w:r>
@@ -7981,7 +7849,7 @@
       <w:pPr>
         <w:pStyle w:val="berschrift3"/>
       </w:pPr>
-      <w:bookmarkStart w:id="37" w:name="_Toc146719160"/>
+      <w:bookmarkStart w:id="37" w:name="_Toc228104625"/>
       <w:r>
         <w:t>Change</w:t>
       </w:r>
@@ -8016,7 +7884,7 @@
       <w:pPr>
         <w:pStyle w:val="berschrift1"/>
       </w:pPr>
-      <w:bookmarkStart w:id="38" w:name="_Toc146719161"/>
+      <w:bookmarkStart w:id="38" w:name="_Toc228104626"/>
       <w:r>
         <w:lastRenderedPageBreak/>
         <w:t>Taking an SMP offline</w:t>
@@ -8155,7 +8023,7 @@
 </file>
 
 <file path=word/endnotes.xml><?xml version="1.0" encoding="utf-8"?>
-<w:endnotes xmlns:wpc="http://schemas.microsoft.com/office/word/2010/wordprocessingCanvas" xmlns:cx="http://schemas.microsoft.com/office/drawing/2014/chartex" xmlns:cx1="http://schemas.microsoft.com/office/drawing/2015/9/8/chartex" xmlns:cx2="http://schemas.microsoft.com/office/drawing/2015/10/21/chartex" xmlns:cx3="http://schemas.microsoft.com/office/drawing/2016/5/9/chartex" xmlns:cx4="http://schemas.microsoft.com/office/drawing/2016/5/10/chartex" xmlns:cx5="http://schemas.microsoft.com/office/drawing/2016/5/11/chartex" xmlns:cx6="http://schemas.microsoft.com/office/drawing/2016/5/12/chartex" xmlns:cx7="http://schemas.microsoft.com/office/drawing/2016/5/13/chartex" xmlns:cx8="http://schemas.microsoft.com/office/drawing/2016/5/14/chartex" xmlns:mc="http://schemas.openxmlformats.org/markup-compatibility/2006" xmlns:aink="http://schemas.microsoft.com/office/drawing/2016/ink" xmlns:am3d="http://schemas.microsoft.com/office/drawing/2017/model3d" xmlns:o="urn:schemas-microsoft-com:office:office" xmlns:oel="http://schemas.microsoft.com/office/2019/extlst" xmlns:r="http://schemas.openxmlformats.org/officeDocument/2006/relationships" xmlns:m="http://schemas.openxmlformats.org/officeDocument/2006/math" xmlns:v="urn:schemas-microsoft-com:vml" xmlns:wp14="http://schemas.microsoft.com/office/word/2010/wordprocessingDrawing" xmlns:wp="http://schemas.openxmlformats.org/drawingml/2006/wordprocessingDrawing" xmlns:w10="urn:schemas-microsoft-com:office:word" xmlns:w="http://schemas.openxmlformats.org/wordprocessingml/2006/main" xmlns:w14="http://schemas.microsoft.com/office/word/2010/wordml" xmlns:w15="http://schemas.microsoft.com/office/word/2012/wordml" xmlns:w16cex="http://schemas.microsoft.com/office/word/2018/wordml/cex" xmlns:w16cid="http://schemas.microsoft.com/office/word/2016/wordml/cid" xmlns:w16="http://schemas.microsoft.com/office/word/2018/wordml" xmlns:w16sdtdh="http://schemas.microsoft.com/office/word/2020/wordml/sdtdatahash" xmlns:w16se="http://schemas.microsoft.com/office/word/2015/wordml/symex" xmlns:wpg="http://schemas.microsoft.com/office/word/2010/wordprocessingGroup" xmlns:wpi="http://schemas.microsoft.com/office/word/2010/wordprocessingInk" xmlns:wne="http://schemas.microsoft.com/office/word/2006/wordml" xmlns:wps="http://schemas.microsoft.com/office/word/2010/wordprocessingShape" mc:Ignorable="w14 w15 w16se w16cid w16 w16cex w16sdtdh wp14">
+<w:endnotes xmlns:wpc="http://schemas.microsoft.com/office/word/2010/wordprocessingCanvas" xmlns:cx="http://schemas.microsoft.com/office/drawing/2014/chartex" xmlns:cx1="http://schemas.microsoft.com/office/drawing/2015/9/8/chartex" xmlns:cx2="http://schemas.microsoft.com/office/drawing/2015/10/21/chartex" xmlns:cx3="http://schemas.microsoft.com/office/drawing/2016/5/9/chartex" xmlns:cx4="http://schemas.microsoft.com/office/drawing/2016/5/10/chartex" xmlns:cx5="http://schemas.microsoft.com/office/drawing/2016/5/11/chartex" xmlns:cx6="http://schemas.microsoft.com/office/drawing/2016/5/12/chartex" xmlns:cx7="http://schemas.microsoft.com/office/drawing/2016/5/13/chartex" xmlns:cx8="http://schemas.microsoft.com/office/drawing/2016/5/14/chartex" xmlns:mc="http://schemas.openxmlformats.org/markup-compatibility/2006" xmlns:aink="http://schemas.microsoft.com/office/drawing/2016/ink" xmlns:am3d="http://schemas.microsoft.com/office/drawing/2017/model3d" xmlns:o="urn:schemas-microsoft-com:office:office" xmlns:oel="http://schemas.microsoft.com/office/2019/extlst" xmlns:r="http://schemas.openxmlformats.org/officeDocument/2006/relationships" xmlns:m="http://schemas.openxmlformats.org/officeDocument/2006/math" xmlns:v="urn:schemas-microsoft-com:vml" xmlns:wp14="http://schemas.microsoft.com/office/word/2010/wordprocessingDrawing" xmlns:wp="http://schemas.openxmlformats.org/drawingml/2006/wordprocessingDrawing" xmlns:w10="urn:schemas-microsoft-com:office:word" xmlns:w="http://schemas.openxmlformats.org/wordprocessingml/2006/main" xmlns:w14="http://schemas.microsoft.com/office/word/2010/wordml" xmlns:w15="http://schemas.microsoft.com/office/word/2012/wordml" xmlns:w16cex="http://schemas.microsoft.com/office/word/2018/wordml/cex" xmlns:w16cid="http://schemas.microsoft.com/office/word/2016/wordml/cid" xmlns:w16="http://schemas.microsoft.com/office/word/2018/wordml" xmlns:w16du="http://schemas.microsoft.com/office/word/2023/wordml/word16du" xmlns:w16sdtdh="http://schemas.microsoft.com/office/word/2020/wordml/sdtdatahash" xmlns:w16sdtfl="http://schemas.microsoft.com/office/word/2024/wordml/sdtformatlock" xmlns:w16se="http://schemas.microsoft.com/office/word/2015/wordml/symex" xmlns:wpg="http://schemas.microsoft.com/office/word/2010/wordprocessingGroup" xmlns:wpi="http://schemas.microsoft.com/office/word/2010/wordprocessingInk" xmlns:wne="http://schemas.microsoft.com/office/word/2006/wordml" xmlns:wps="http://schemas.microsoft.com/office/word/2010/wordprocessingShape" mc:Ignorable="w14 w15 w16se w16cid w16 w16cex w16sdtdh w16sdtfl w16du wp14">
   <w:endnote w:type="separator" w:id="-1">
     <w:p>
       <w:pPr>
@@ -8180,7 +8048,7 @@
 </file>
 
 <file path=word/footer1.xml><?xml version="1.0" encoding="utf-8"?>
-<w:ftr xmlns:wpc="http://schemas.microsoft.com/office/word/2010/wordprocessingCanvas" xmlns:cx="http://schemas.microsoft.com/office/drawing/2014/chartex" xmlns:cx1="http://schemas.microsoft.com/office/drawing/2015/9/8/chartex" xmlns:cx2="http://schemas.microsoft.com/office/drawing/2015/10/21/chartex" xmlns:cx3="http://schemas.microsoft.com/office/drawing/2016/5/9/chartex" xmlns:cx4="http://schemas.microsoft.com/office/drawing/2016/5/10/chartex" xmlns:cx5="http://schemas.microsoft.com/office/drawing/2016/5/11/chartex" xmlns:cx6="http://schemas.microsoft.com/office/drawing/2016/5/12/chartex" xmlns:cx7="http://schemas.microsoft.com/office/drawing/2016/5/13/chartex" xmlns:cx8="http://schemas.microsoft.com/office/drawing/2016/5/14/chartex" xmlns:mc="http://schemas.openxmlformats.org/markup-compatibility/2006" xmlns:aink="http://schemas.microsoft.com/office/drawing/2016/ink" xmlns:am3d="http://schemas.microsoft.com/office/drawing/2017/model3d" xmlns:o="urn:schemas-microsoft-com:office:office" xmlns:oel="http://schemas.microsoft.com/office/2019/extlst" xmlns:r="http://schemas.openxmlformats.org/officeDocument/2006/relationships" xmlns:m="http://schemas.openxmlformats.org/officeDocument/2006/math" xmlns:v="urn:schemas-microsoft-com:vml" xmlns:wp14="http://schemas.microsoft.com/office/word/2010/wordprocessingDrawing" xmlns:wp="http://schemas.openxmlformats.org/drawingml/2006/wordprocessingDrawing" xmlns:w10="urn:schemas-microsoft-com:office:word" xmlns:w="http://schemas.openxmlformats.org/wordprocessingml/2006/main" xmlns:w14="http://schemas.microsoft.com/office/word/2010/wordml" xmlns:w15="http://schemas.microsoft.com/office/word/2012/wordml" xmlns:w16cex="http://schemas.microsoft.com/office/word/2018/wordml/cex" xmlns:w16cid="http://schemas.microsoft.com/office/word/2016/wordml/cid" xmlns:w16="http://schemas.microsoft.com/office/word/2018/wordml" xmlns:w16sdtdh="http://schemas.microsoft.com/office/word/2020/wordml/sdtdatahash" xmlns:w16se="http://schemas.microsoft.com/office/word/2015/wordml/symex" xmlns:wpg="http://schemas.microsoft.com/office/word/2010/wordprocessingGroup" xmlns:wpi="http://schemas.microsoft.com/office/word/2010/wordprocessingInk" xmlns:wne="http://schemas.microsoft.com/office/word/2006/wordml" xmlns:wps="http://schemas.microsoft.com/office/word/2010/wordprocessingShape" mc:Ignorable="w14 w15 w16se w16cid w16 w16cex w16sdtdh wp14">
+<w:ftr xmlns:wpc="http://schemas.microsoft.com/office/word/2010/wordprocessingCanvas" xmlns:cx="http://schemas.microsoft.com/office/drawing/2014/chartex" xmlns:cx1="http://schemas.microsoft.com/office/drawing/2015/9/8/chartex" xmlns:cx2="http://schemas.microsoft.com/office/drawing/2015/10/21/chartex" xmlns:cx3="http://schemas.microsoft.com/office/drawing/2016/5/9/chartex" xmlns:cx4="http://schemas.microsoft.com/office/drawing/2016/5/10/chartex" xmlns:cx5="http://schemas.microsoft.com/office/drawing/2016/5/11/chartex" xmlns:cx6="http://schemas.microsoft.com/office/drawing/2016/5/12/chartex" xmlns:cx7="http://schemas.microsoft.com/office/drawing/2016/5/13/chartex" xmlns:cx8="http://schemas.microsoft.com/office/drawing/2016/5/14/chartex" xmlns:mc="http://schemas.openxmlformats.org/markup-compatibility/2006" xmlns:aink="http://schemas.microsoft.com/office/drawing/2016/ink" xmlns:am3d="http://schemas.microsoft.com/office/drawing/2017/model3d" xmlns:o="urn:schemas-microsoft-com:office:office" xmlns:oel="http://schemas.microsoft.com/office/2019/extlst" xmlns:r="http://schemas.openxmlformats.org/officeDocument/2006/relationships" xmlns:m="http://schemas.openxmlformats.org/officeDocument/2006/math" xmlns:v="urn:schemas-microsoft-com:vml" xmlns:wp14="http://schemas.microsoft.com/office/word/2010/wordprocessingDrawing" xmlns:wp="http://schemas.openxmlformats.org/drawingml/2006/wordprocessingDrawing" xmlns:w10="urn:schemas-microsoft-com:office:word" xmlns:w="http://schemas.openxmlformats.org/wordprocessingml/2006/main" xmlns:w14="http://schemas.microsoft.com/office/word/2010/wordml" xmlns:w15="http://schemas.microsoft.com/office/word/2012/wordml" xmlns:w16cex="http://schemas.microsoft.com/office/word/2018/wordml/cex" xmlns:w16cid="http://schemas.microsoft.com/office/word/2016/wordml/cid" xmlns:w16="http://schemas.microsoft.com/office/word/2018/wordml" xmlns:w16du="http://schemas.microsoft.com/office/word/2023/wordml/word16du" xmlns:w16sdtdh="http://schemas.microsoft.com/office/word/2020/wordml/sdtdatahash" xmlns:w16sdtfl="http://schemas.microsoft.com/office/word/2024/wordml/sdtformatlock" xmlns:w16se="http://schemas.microsoft.com/office/word/2015/wordml/symex" xmlns:wpg="http://schemas.microsoft.com/office/word/2010/wordprocessingGroup" xmlns:wpi="http://schemas.microsoft.com/office/word/2010/wordprocessingInk" xmlns:wne="http://schemas.microsoft.com/office/word/2006/wordml" xmlns:wps="http://schemas.microsoft.com/office/word/2010/wordprocessingShape" mc:Ignorable="w14 w15 w16se w16cid w16 w16cex w16sdtdh w16sdtfl w16du wp14">
   <w:p>
     <w:pPr>
       <w:pStyle w:val="Fuzeile"/>
@@ -8317,7 +8185,7 @@
 </file>
 
 <file path=word/footnotes.xml><?xml version="1.0" encoding="utf-8"?>
-<w:footnotes xmlns:wpc="http://schemas.microsoft.com/office/word/2010/wordprocessingCanvas" xmlns:cx="http://schemas.microsoft.com/office/drawing/2014/chartex" xmlns:cx1="http://schemas.microsoft.com/office/drawing/2015/9/8/chartex" xmlns:cx2="http://schemas.microsoft.com/office/drawing/2015/10/21/chartex" xmlns:cx3="http://schemas.microsoft.com/office/drawing/2016/5/9/chartex" xmlns:cx4="http://schemas.microsoft.com/office/drawing/2016/5/10/chartex" xmlns:cx5="http://schemas.microsoft.com/office/drawing/2016/5/11/chartex" xmlns:cx6="http://schemas.microsoft.com/office/drawing/2016/5/12/chartex" xmlns:cx7="http://schemas.microsoft.com/office/drawing/2016/5/13/chartex" xmlns:cx8="http://schemas.microsoft.com/office/drawing/2016/5/14/chartex" xmlns:mc="http://schemas.openxmlformats.org/markup-compatibility/2006" xmlns:aink="http://schemas.microsoft.com/office/drawing/2016/ink" xmlns:am3d="http://schemas.microsoft.com/office/drawing/2017/model3d" xmlns:o="urn:schemas-microsoft-com:office:office" xmlns:oel="http://schemas.microsoft.com/office/2019/extlst" xmlns:r="http://schemas.openxmlformats.org/officeDocument/2006/relationships" xmlns:m="http://schemas.openxmlformats.org/officeDocument/2006/math" xmlns:v="urn:schemas-microsoft-com:vml" xmlns:wp14="http://schemas.microsoft.com/office/word/2010/wordprocessingDrawing" xmlns:wp="http://schemas.openxmlformats.org/drawingml/2006/wordprocessingDrawing" xmlns:w10="urn:schemas-microsoft-com:office:word" xmlns:w="http://schemas.openxmlformats.org/wordprocessingml/2006/main" xmlns:w14="http://schemas.microsoft.com/office/word/2010/wordml" xmlns:w15="http://schemas.microsoft.com/office/word/2012/wordml" xmlns:w16cex="http://schemas.microsoft.com/office/word/2018/wordml/cex" xmlns:w16cid="http://schemas.microsoft.com/office/word/2016/wordml/cid" xmlns:w16="http://schemas.microsoft.com/office/word/2018/wordml" xmlns:w16sdtdh="http://schemas.microsoft.com/office/word/2020/wordml/sdtdatahash" xmlns:w16se="http://schemas.microsoft.com/office/word/2015/wordml/symex" xmlns:wpg="http://schemas.microsoft.com/office/word/2010/wordprocessingGroup" xmlns:wpi="http://schemas.microsoft.com/office/word/2010/wordprocessingInk" xmlns:wne="http://schemas.microsoft.com/office/word/2006/wordml" xmlns:wps="http://schemas.microsoft.com/office/word/2010/wordprocessingShape" mc:Ignorable="w14 w15 w16se w16cid w16 w16cex w16sdtdh wp14">
+<w:footnotes xmlns:wpc="http://schemas.microsoft.com/office/word/2010/wordprocessingCanvas" xmlns:cx="http://schemas.microsoft.com/office/drawing/2014/chartex" xmlns:cx1="http://schemas.microsoft.com/office/drawing/2015/9/8/chartex" xmlns:cx2="http://schemas.microsoft.com/office/drawing/2015/10/21/chartex" xmlns:cx3="http://schemas.microsoft.com/office/drawing/2016/5/9/chartex" xmlns:cx4="http://schemas.microsoft.com/office/drawing/2016/5/10/chartex" xmlns:cx5="http://schemas.microsoft.com/office/drawing/2016/5/11/chartex" xmlns:cx6="http://schemas.microsoft.com/office/drawing/2016/5/12/chartex" xmlns:cx7="http://schemas.microsoft.com/office/drawing/2016/5/13/chartex" xmlns:cx8="http://schemas.microsoft.com/office/drawing/2016/5/14/chartex" xmlns:mc="http://schemas.openxmlformats.org/markup-compatibility/2006" xmlns:aink="http://schemas.microsoft.com/office/drawing/2016/ink" xmlns:am3d="http://schemas.microsoft.com/office/drawing/2017/model3d" xmlns:o="urn:schemas-microsoft-com:office:office" xmlns:oel="http://schemas.microsoft.com/office/2019/extlst" xmlns:r="http://schemas.openxmlformats.org/officeDocument/2006/relationships" xmlns:m="http://schemas.openxmlformats.org/officeDocument/2006/math" xmlns:v="urn:schemas-microsoft-com:vml" xmlns:wp14="http://schemas.microsoft.com/office/word/2010/wordprocessingDrawing" xmlns:wp="http://schemas.openxmlformats.org/drawingml/2006/wordprocessingDrawing" xmlns:w10="urn:schemas-microsoft-com:office:word" xmlns:w="http://schemas.openxmlformats.org/wordprocessingml/2006/main" xmlns:w14="http://schemas.microsoft.com/office/word/2010/wordml" xmlns:w15="http://schemas.microsoft.com/office/word/2012/wordml" xmlns:w16cex="http://schemas.microsoft.com/office/word/2018/wordml/cex" xmlns:w16cid="http://schemas.microsoft.com/office/word/2016/wordml/cid" xmlns:w16="http://schemas.microsoft.com/office/word/2018/wordml" xmlns:w16du="http://schemas.microsoft.com/office/word/2023/wordml/word16du" xmlns:w16sdtdh="http://schemas.microsoft.com/office/word/2020/wordml/sdtdatahash" xmlns:w16sdtfl="http://schemas.microsoft.com/office/word/2024/wordml/sdtformatlock" xmlns:w16se="http://schemas.microsoft.com/office/word/2015/wordml/symex" xmlns:wpg="http://schemas.microsoft.com/office/word/2010/wordprocessingGroup" xmlns:wpi="http://schemas.microsoft.com/office/word/2010/wordprocessingInk" xmlns:wne="http://schemas.microsoft.com/office/word/2006/wordml" xmlns:wps="http://schemas.microsoft.com/office/word/2010/wordprocessingShape" mc:Ignorable="w14 w15 w16se w16cid w16 w16cex w16sdtdh w16sdtfl w16du wp14">
   <w:footnote w:type="separator" w:id="-1">
     <w:p>
       <w:pPr>
@@ -8335,53 +8203,6 @@
       </w:pPr>
       <w:r>
         <w:continuationSeparator/>
-      </w:r>
-    </w:p>
-  </w:footnote>
-  <w:footnote w:id="1">
-    <w:p>
-      <w:pPr>
-        <w:pStyle w:val="Funotentext"/>
-      </w:pPr>
-      <w:r>
-        <w:rPr>
-          <w:rStyle w:val="Funotenzeichen"/>
-        </w:rPr>
-        <w:footnoteRef/>
-      </w:r>
-      <w:r>
-        <w:t xml:space="preserve"> </w:t>
-      </w:r>
-      <w:r>
-        <w:t>The name „ROOT“ is standard v</w:t>
-      </w:r>
-      <w:r>
-        <w:t>alue in JavaEE application servers as the alias for the root directory of the server</w:t>
-      </w:r>
-      <w:r>
-        <w:t>.</w:t>
-      </w:r>
-    </w:p>
-  </w:footnote>
-  <w:footnote w:id="2">
-    <w:p>
-      <w:pPr>
-        <w:pStyle w:val="Funotentext"/>
-      </w:pPr>
-      <w:r>
-        <w:rPr>
-          <w:rStyle w:val="Funotenzeichen"/>
-        </w:rPr>
-        <w:footnoteRef/>
-      </w:r>
-      <w:r>
-        <w:t xml:space="preserve"> </w:t>
-      </w:r>
-      <w:r>
-        <w:t>See chapter 5.1 for the Peppol S</w:t>
-      </w:r>
-      <w:r>
-        <w:t>MP specification: “A service implementing the REST profile MUST NOT use TLS (Transport Layer Security) or SSL (Secure Sockets Layer).”</w:t>
       </w:r>
     </w:p>
   </w:footnote>
@@ -8389,7 +8210,7 @@
 </file>
 
 <file path=word/header1.xml><?xml version="1.0" encoding="utf-8"?>
-<w:hdr xmlns:wpc="http://schemas.microsoft.com/office/word/2010/wordprocessingCanvas" xmlns:cx="http://schemas.microsoft.com/office/drawing/2014/chartex" xmlns:cx1="http://schemas.microsoft.com/office/drawing/2015/9/8/chartex" xmlns:cx2="http://schemas.microsoft.com/office/drawing/2015/10/21/chartex" xmlns:cx3="http://schemas.microsoft.com/office/drawing/2016/5/9/chartex" xmlns:cx4="http://schemas.microsoft.com/office/drawing/2016/5/10/chartex" xmlns:cx5="http://schemas.microsoft.com/office/drawing/2016/5/11/chartex" xmlns:cx6="http://schemas.microsoft.com/office/drawing/2016/5/12/chartex" xmlns:cx7="http://schemas.microsoft.com/office/drawing/2016/5/13/chartex" xmlns:cx8="http://schemas.microsoft.com/office/drawing/2016/5/14/chartex" xmlns:mc="http://schemas.openxmlformats.org/markup-compatibility/2006" xmlns:aink="http://schemas.microsoft.com/office/drawing/2016/ink" xmlns:am3d="http://schemas.microsoft.com/office/drawing/2017/model3d" xmlns:o="urn:schemas-microsoft-com:office:office" xmlns:oel="http://schemas.microsoft.com/office/2019/extlst" xmlns:r="http://schemas.openxmlformats.org/officeDocument/2006/relationships" xmlns:m="http://schemas.openxmlformats.org/officeDocument/2006/math" xmlns:v="urn:schemas-microsoft-com:vml" xmlns:wp14="http://schemas.microsoft.com/office/word/2010/wordprocessingDrawing" xmlns:wp="http://schemas.openxmlformats.org/drawingml/2006/wordprocessingDrawing" xmlns:w10="urn:schemas-microsoft-com:office:word" xmlns:w="http://schemas.openxmlformats.org/wordprocessingml/2006/main" xmlns:w14="http://schemas.microsoft.com/office/word/2010/wordml" xmlns:w15="http://schemas.microsoft.com/office/word/2012/wordml" xmlns:w16cex="http://schemas.microsoft.com/office/word/2018/wordml/cex" xmlns:w16cid="http://schemas.microsoft.com/office/word/2016/wordml/cid" xmlns:w16="http://schemas.microsoft.com/office/word/2018/wordml" xmlns:w16sdtdh="http://schemas.microsoft.com/office/word/2020/wordml/sdtdatahash" xmlns:w16se="http://schemas.microsoft.com/office/word/2015/wordml/symex" xmlns:wpg="http://schemas.microsoft.com/office/word/2010/wordprocessingGroup" xmlns:wpi="http://schemas.microsoft.com/office/word/2010/wordprocessingInk" xmlns:wne="http://schemas.microsoft.com/office/word/2006/wordml" xmlns:wps="http://schemas.microsoft.com/office/word/2010/wordprocessingShape" mc:Ignorable="w14 w15 w16se w16cid w16 w16cex w16sdtdh wp14">
+<w:hdr xmlns:wpc="http://schemas.microsoft.com/office/word/2010/wordprocessingCanvas" xmlns:cx="http://schemas.microsoft.com/office/drawing/2014/chartex" xmlns:cx1="http://schemas.microsoft.com/office/drawing/2015/9/8/chartex" xmlns:cx2="http://schemas.microsoft.com/office/drawing/2015/10/21/chartex" xmlns:cx3="http://schemas.microsoft.com/office/drawing/2016/5/9/chartex" xmlns:cx4="http://schemas.microsoft.com/office/drawing/2016/5/10/chartex" xmlns:cx5="http://schemas.microsoft.com/office/drawing/2016/5/11/chartex" xmlns:cx6="http://schemas.microsoft.com/office/drawing/2016/5/12/chartex" xmlns:cx7="http://schemas.microsoft.com/office/drawing/2016/5/13/chartex" xmlns:cx8="http://schemas.microsoft.com/office/drawing/2016/5/14/chartex" xmlns:mc="http://schemas.openxmlformats.org/markup-compatibility/2006" xmlns:aink="http://schemas.microsoft.com/office/drawing/2016/ink" xmlns:am3d="http://schemas.microsoft.com/office/drawing/2017/model3d" xmlns:o="urn:schemas-microsoft-com:office:office" xmlns:oel="http://schemas.microsoft.com/office/2019/extlst" xmlns:r="http://schemas.openxmlformats.org/officeDocument/2006/relationships" xmlns:m="http://schemas.openxmlformats.org/officeDocument/2006/math" xmlns:v="urn:schemas-microsoft-com:vml" xmlns:wp14="http://schemas.microsoft.com/office/word/2010/wordprocessingDrawing" xmlns:wp="http://schemas.openxmlformats.org/drawingml/2006/wordprocessingDrawing" xmlns:w10="urn:schemas-microsoft-com:office:word" xmlns:w="http://schemas.openxmlformats.org/wordprocessingml/2006/main" xmlns:w14="http://schemas.microsoft.com/office/word/2010/wordml" xmlns:w15="http://schemas.microsoft.com/office/word/2012/wordml" xmlns:w16cex="http://schemas.microsoft.com/office/word/2018/wordml/cex" xmlns:w16cid="http://schemas.microsoft.com/office/word/2016/wordml/cid" xmlns:w16="http://schemas.microsoft.com/office/word/2018/wordml" xmlns:w16du="http://schemas.microsoft.com/office/word/2023/wordml/word16du" xmlns:w16sdtdh="http://schemas.microsoft.com/office/word/2020/wordml/sdtdatahash" xmlns:w16sdtfl="http://schemas.microsoft.com/office/word/2024/wordml/sdtformatlock" xmlns:w16se="http://schemas.microsoft.com/office/word/2015/wordml/symex" xmlns:wpg="http://schemas.microsoft.com/office/word/2010/wordprocessingGroup" xmlns:wpi="http://schemas.microsoft.com/office/word/2010/wordprocessingInk" xmlns:wne="http://schemas.microsoft.com/office/word/2006/wordml" xmlns:wps="http://schemas.microsoft.com/office/word/2010/wordprocessingShape" mc:Ignorable="w14 w15 w16se w16cid w16 w16cex w16sdtdh w16sdtfl w16du wp14">
   <w:p>
     <w:pPr>
       <w:pStyle w:val="Kopfzeile"/>
@@ -8570,7 +8391,7 @@
 </file>
 
 <file path=word/numbering.xml><?xml version="1.0" encoding="utf-8"?>
-<w:numbering xmlns:wpc="http://schemas.microsoft.com/office/word/2010/wordprocessingCanvas" xmlns:cx="http://schemas.microsoft.com/office/drawing/2014/chartex" xmlns:cx1="http://schemas.microsoft.com/office/drawing/2015/9/8/chartex" xmlns:cx2="http://schemas.microsoft.com/office/drawing/2015/10/21/chartex" xmlns:cx3="http://schemas.microsoft.com/office/drawing/2016/5/9/chartex" xmlns:cx4="http://schemas.microsoft.com/office/drawing/2016/5/10/chartex" xmlns:cx5="http://schemas.microsoft.com/office/drawing/2016/5/11/chartex" xmlns:cx6="http://schemas.microsoft.com/office/drawing/2016/5/12/chartex" xmlns:cx7="http://schemas.microsoft.com/office/drawing/2016/5/13/chartex" xmlns:cx8="http://schemas.microsoft.com/office/drawing/2016/5/14/chartex" xmlns:mc="http://schemas.openxmlformats.org/markup-compatibility/2006" xmlns:aink="http://schemas.microsoft.com/office/drawing/2016/ink" xmlns:am3d="http://schemas.microsoft.com/office/drawing/2017/model3d" xmlns:o="urn:schemas-microsoft-com:office:office" xmlns:oel="http://schemas.microsoft.com/office/2019/extlst" xmlns:r="http://schemas.openxmlformats.org/officeDocument/2006/relationships" xmlns:m="http://schemas.openxmlformats.org/officeDocument/2006/math" xmlns:v="urn:schemas-microsoft-com:vml" xmlns:wp14="http://schemas.microsoft.com/office/word/2010/wordprocessingDrawing" xmlns:wp="http://schemas.openxmlformats.org/drawingml/2006/wordprocessingDrawing" xmlns:w10="urn:schemas-microsoft-com:office:word" xmlns:w="http://schemas.openxmlformats.org/wordprocessingml/2006/main" xmlns:w14="http://schemas.microsoft.com/office/word/2010/wordml" xmlns:w15="http://schemas.microsoft.com/office/word/2012/wordml" xmlns:w16cex="http://schemas.microsoft.com/office/word/2018/wordml/cex" xmlns:w16cid="http://schemas.microsoft.com/office/word/2016/wordml/cid" xmlns:w16="http://schemas.microsoft.com/office/word/2018/wordml" xmlns:w16sdtdh="http://schemas.microsoft.com/office/word/2020/wordml/sdtdatahash" xmlns:w16se="http://schemas.microsoft.com/office/word/2015/wordml/symex" xmlns:wpg="http://schemas.microsoft.com/office/word/2010/wordprocessingGroup" xmlns:wpi="http://schemas.microsoft.com/office/word/2010/wordprocessingInk" xmlns:wne="http://schemas.microsoft.com/office/word/2006/wordml" xmlns:wps="http://schemas.microsoft.com/office/word/2010/wordprocessingShape" mc:Ignorable="w14 w15 w16se w16cid w16 w16cex w16sdtdh wp14">
+<w:numbering xmlns:wpc="http://schemas.microsoft.com/office/word/2010/wordprocessingCanvas" xmlns:cx="http://schemas.microsoft.com/office/drawing/2014/chartex" xmlns:cx1="http://schemas.microsoft.com/office/drawing/2015/9/8/chartex" xmlns:cx2="http://schemas.microsoft.com/office/drawing/2015/10/21/chartex" xmlns:cx3="http://schemas.microsoft.com/office/drawing/2016/5/9/chartex" xmlns:cx4="http://schemas.microsoft.com/office/drawing/2016/5/10/chartex" xmlns:cx5="http://schemas.microsoft.com/office/drawing/2016/5/11/chartex" xmlns:cx6="http://schemas.microsoft.com/office/drawing/2016/5/12/chartex" xmlns:cx7="http://schemas.microsoft.com/office/drawing/2016/5/13/chartex" xmlns:cx8="http://schemas.microsoft.com/office/drawing/2016/5/14/chartex" xmlns:mc="http://schemas.openxmlformats.org/markup-compatibility/2006" xmlns:aink="http://schemas.microsoft.com/office/drawing/2016/ink" xmlns:am3d="http://schemas.microsoft.com/office/drawing/2017/model3d" xmlns:o="urn:schemas-microsoft-com:office:office" xmlns:oel="http://schemas.microsoft.com/office/2019/extlst" xmlns:r="http://schemas.openxmlformats.org/officeDocument/2006/relationships" xmlns:m="http://schemas.openxmlformats.org/officeDocument/2006/math" xmlns:v="urn:schemas-microsoft-com:vml" xmlns:wp14="http://schemas.microsoft.com/office/word/2010/wordprocessingDrawing" xmlns:wp="http://schemas.openxmlformats.org/drawingml/2006/wordprocessingDrawing" xmlns:w10="urn:schemas-microsoft-com:office:word" xmlns:w="http://schemas.openxmlformats.org/wordprocessingml/2006/main" xmlns:w14="http://schemas.microsoft.com/office/word/2010/wordml" xmlns:w15="http://schemas.microsoft.com/office/word/2012/wordml" xmlns:w16cex="http://schemas.microsoft.com/office/word/2018/wordml/cex" xmlns:w16cid="http://schemas.microsoft.com/office/word/2016/wordml/cid" xmlns:w16="http://schemas.microsoft.com/office/word/2018/wordml" xmlns:w16du="http://schemas.microsoft.com/office/word/2023/wordml/word16du" xmlns:w16sdtdh="http://schemas.microsoft.com/office/word/2020/wordml/sdtdatahash" xmlns:w16sdtfl="http://schemas.microsoft.com/office/word/2024/wordml/sdtformatlock" xmlns:w16se="http://schemas.microsoft.com/office/word/2015/wordml/symex" xmlns:wpg="http://schemas.microsoft.com/office/word/2010/wordprocessingGroup" xmlns:wpi="http://schemas.microsoft.com/office/word/2010/wordprocessingInk" xmlns:wne="http://schemas.microsoft.com/office/word/2006/wordml" xmlns:wps="http://schemas.microsoft.com/office/word/2010/wordprocessingShape" mc:Ignorable="w14 w15 w16se w16cid w16 w16cex w16sdtdh w16sdtfl w16du wp14">
   <w:abstractNum w:abstractNumId="0" w15:restartNumberingAfterBreak="0">
     <w:nsid w:val="0D4677DF"/>
     <w:multiLevelType w:val="multilevel"/>
@@ -9804,7 +9625,7 @@
 </file>
 
 <file path=word/styles.xml><?xml version="1.0" encoding="utf-8"?>
-<w:styles xmlns:mc="http://schemas.openxmlformats.org/markup-compatibility/2006" xmlns:r="http://schemas.openxmlformats.org/officeDocument/2006/relationships" xmlns:w="http://schemas.openxmlformats.org/wordprocessingml/2006/main" xmlns:w14="http://schemas.microsoft.com/office/word/2010/wordml" xmlns:w15="http://schemas.microsoft.com/office/word/2012/wordml" xmlns:w16cex="http://schemas.microsoft.com/office/word/2018/wordml/cex" xmlns:w16cid="http://schemas.microsoft.com/office/word/2016/wordml/cid" xmlns:w16="http://schemas.microsoft.com/office/word/2018/wordml" xmlns:w16sdtdh="http://schemas.microsoft.com/office/word/2020/wordml/sdtdatahash" xmlns:w16se="http://schemas.microsoft.com/office/word/2015/wordml/symex" mc:Ignorable="w14 w15 w16se w16cid w16 w16cex w16sdtdh">
+<w:styles xmlns:mc="http://schemas.openxmlformats.org/markup-compatibility/2006" xmlns:r="http://schemas.openxmlformats.org/officeDocument/2006/relationships" xmlns:w="http://schemas.openxmlformats.org/wordprocessingml/2006/main" xmlns:w14="http://schemas.microsoft.com/office/word/2010/wordml" xmlns:w15="http://schemas.microsoft.com/office/word/2012/wordml" xmlns:w16cex="http://schemas.microsoft.com/office/word/2018/wordml/cex" xmlns:w16cid="http://schemas.microsoft.com/office/word/2016/wordml/cid" xmlns:w16="http://schemas.microsoft.com/office/word/2018/wordml" xmlns:w16du="http://schemas.microsoft.com/office/word/2023/wordml/word16du" xmlns:w16sdtdh="http://schemas.microsoft.com/office/word/2020/wordml/sdtdatahash" xmlns:w16sdtfl="http://schemas.microsoft.com/office/word/2024/wordml/sdtformatlock" xmlns:w16se="http://schemas.microsoft.com/office/word/2015/wordml/symex" mc:Ignorable="w14 w15 w16se w16cid w16 w16cex w16sdtdh w16sdtfl w16du">
   <w:docDefaults>
     <w:rPrDefault>
       <w:rPr>

</xml_diff>